<commit_message>
feat: migrate Feast local feature store to SQLite with host bind mount and expanded screenshots
</commit_message>
<xml_diff>
--- a/Dockerizing_Feast_Local_Feature_Store_Lab.docx
+++ b/Dockerizing_Feast_Local_Feature_Store_Lab.docx
@@ -14,7 +14,7 @@
           <w:color w:val="091E42"/>
           <w:sz w:val="44"/>
         </w:rPr>
-        <w:t>Dockerizing Feast: Building a Local Feature Store with Docker and Redis</w:t>
+        <w:t>Dockerizing Feast: Building a Local Feature Store with Docker and SQLite</w:t>
       </w:r>
     </w:p>
     <w:p>
@@ -55,7 +55,7 @@
           <w:color w:val="172B4D"/>
           <w:sz w:val="21"/>
         </w:rPr>
-        <w:t>This lab teaches you how to containerize Feast, an open-source feature store, using Docker and Docker Compose. You will construct a local feature store architecture that pairs a file-based Parquet offline store with an in-memory Redis online store, exposing feature vectors through an HTTP REST endpoint and visual catalog.</w:t>
+        <w:t>This lab teaches you how to containerize Feast, an open-source feature store, using Docker and Docker Compose. You will construct a local feature store architecture that pairs a file-based Parquet offline store with an embedded SQLite online store, exposing feature vectors through an HTTP REST endpoint and visual catalog.</w:t>
       </w:r>
     </w:p>
     <w:p>
@@ -66,7 +66,7 @@
       <w:r>
         <w:drawing>
           <wp:inline xmlns:a="http://schemas.openxmlformats.org/drawingml/2006/main" xmlns:pic="http://schemas.openxmlformats.org/drawingml/2006/picture">
-            <wp:extent cx="5486400" cy="3064669"/>
+            <wp:extent cx="5486400" cy="3062177"/>
             <wp:docPr id="1" name="Picture 1"/>
             <wp:cNvGraphicFramePr>
               <a:graphicFrameLocks noChangeAspect="1"/>
@@ -87,7 +87,7 @@
                   <pic:spPr>
                     <a:xfrm>
                       <a:off x="0" y="0"/>
-                      <a:ext cx="5486400" cy="3064669"/>
+                      <a:ext cx="5486400" cy="3062177"/>
                     </a:xfrm>
                     <a:prstGeom prst="rect"/>
                   </pic:spPr>
@@ -153,7 +153,7 @@
               </w:rPr>
               <w:t>+-----------------------------------------------------------------------+</w:t>
               <w:br/>
-              <w:t>| Docker Host                                                           |</w:t>
+              <w:t>| Docker Host Machine                                                   |</w:t>
               <w:br/>
               <w:t>|                                                                       |</w:t>
               <w:br/>
@@ -171,23 +171,27 @@
               <w:br/>
               <w:t>|  | Web Browser       | :8888  +------------------------------------+  |</w:t>
               <w:br/>
-              <w:t>|  | (Catalog UI)      |-------&gt;| Container: redis                   |  |</w:t>
+              <w:t>|  | (Catalog UI)      |-------&gt;| Container: feast-ui                |  |</w:t>
               <w:br/>
-              <w:t>|  +-------------------+        | (In-memory online feature store)   |  |</w:t>
+              <w:t>|  +-------------------+        | (Interactive Web UI Catalog)       |  |</w:t>
               <w:br/>
-              <w:t>|                               +------------------------------------+  |</w:t>
+              <w:t>|                               +------------------+-----------------+  |</w:t>
               <w:br/>
-              <w:t>|                                                  ^                    |</w:t>
+              <w:t>|                                                  |                    |</w:t>
               <w:br/>
-              <w:t>|  +--------------------------------------------+  | Materialization    |</w:t>
+              <w:t>|             Docker Bind Mount (./feature_repo:/app)                   |</w:t>
               <w:br/>
-              <w:t>|  | Mounted Repository Directory (/app)        |--+ (Batch to Online)  |</w:t>
+              <w:t>|  +-----------------------------------------------+-----------------+  |</w:t>
               <w:br/>
-              <w:t>|  | - feature_store.yaml   - features.py       |                       |</w:t>
+              <w:t>|  | Host Persistent Storage: ./feature_repo/data/                   |  |</w:t>
               <w:br/>
-              <w:t>|  | - data/driver_stats.parquet (Offline Store)|                       |</w:t>
+              <w:t>|  | - driver_stats.parquet   (Offline Historical Batch Data)        |  |</w:t>
               <w:br/>
-              <w:t>|  +--------------------------------------------+                       |</w:t>
+              <w:t>|  | - registry.db            (Schema and Metadata Registry)         |  |</w:t>
+              <w:br/>
+              <w:t>|  | - online_store.db        (SQLite Embedded Online Store)         |  |</w:t>
+              <w:br/>
+              <w:t>|  +-----------------------------------------------------------------+  |</w:t>
               <w:br/>
               <w:t>+-----------------------------------------------------------------------+</w:t>
             </w:r>
@@ -195,6 +199,61 @@
         </w:tc>
       </w:tr>
     </w:tbl>
+    <w:p>
+      <w:pPr>
+        <w:spacing w:before="160" w:after="40"/>
+        <w:jc w:val="center"/>
+      </w:pPr>
+      <w:r>
+        <w:drawing>
+          <wp:inline xmlns:a="http://schemas.openxmlformats.org/drawingml/2006/main" xmlns:pic="http://schemas.openxmlformats.org/drawingml/2006/picture">
+            <wp:extent cx="5486400" cy="3062177"/>
+            <wp:docPr id="2" name="Picture 2"/>
+            <wp:cNvGraphicFramePr>
+              <a:graphicFrameLocks noChangeAspect="1"/>
+            </wp:cNvGraphicFramePr>
+            <a:graphic>
+              <a:graphicData uri="http://schemas.openxmlformats.org/drawingml/2006/picture">
+                <pic:pic>
+                  <pic:nvPicPr>
+                    <pic:cNvPr id="0" name="feast_bind_mount.png"/>
+                    <pic:cNvPicPr/>
+                  </pic:nvPicPr>
+                  <pic:blipFill>
+                    <a:blip r:embed="rId10"/>
+                    <a:stretch>
+                      <a:fillRect/>
+                    </a:stretch>
+                  </pic:blipFill>
+                  <pic:spPr>
+                    <a:xfrm>
+                      <a:off x="0" y="0"/>
+                      <a:ext cx="5486400" cy="3062177"/>
+                    </a:xfrm>
+                    <a:prstGeom prst="rect"/>
+                  </pic:spPr>
+                </pic:pic>
+              </a:graphicData>
+            </a:graphic>
+          </wp:inline>
+        </w:drawing>
+      </w:r>
+    </w:p>
+    <w:p>
+      <w:pPr>
+        <w:spacing w:before="40" w:after="160"/>
+        <w:jc w:val="center"/>
+      </w:pPr>
+      <w:r>
+        <w:rPr>
+          <w:rFonts w:ascii="Calibri" w:hAnsi="Calibri"/>
+          <w:i/>
+          <w:color w:val="6B778C"/>
+          <w:sz w:val="19"/>
+        </w:rPr>
+        <w:t>Figure 2: Host Machine Bind Mount and Storage Architecture</w:t>
+      </w:r>
+    </w:p>
     <w:p>
       <w:pPr>
         <w:spacing w:before="280" w:after="80"/>
@@ -232,7 +291,7 @@
           <w:rFonts w:ascii="Calibri" w:hAnsi="Calibri"/>
           <w:sz w:val="20"/>
         </w:rPr>
-        <w:t>1. Configure a Feast repository targeting local file storage and containerized Redis instances.</w:t>
+        <w:t>1. Configure a Feast repository targeting local Parquet offline storage and SQLite online storage.</w:t>
       </w:r>
     </w:p>
     <w:p>
@@ -245,7 +304,7 @@
           <w:rFonts w:ascii="Calibri" w:hAnsi="Calibri"/>
           <w:sz w:val="20"/>
         </w:rPr>
-        <w:t>2. Build an immutable Docker runtime image with Feast and required database drivers.</w:t>
+        <w:t>2. Persist database state across container lifecycles using host directory bind mounts.</w:t>
       </w:r>
     </w:p>
     <w:p>
@@ -258,7 +317,7 @@
           <w:rFonts w:ascii="Calibri" w:hAnsi="Calibri"/>
           <w:sz w:val="20"/>
         </w:rPr>
-        <w:t>3. Orchestrate multi-container systems using Docker Compose health checks and network definitions.</w:t>
+        <w:t>3. Build an immutable Docker runtime image with Feast and SQLite support.</w:t>
       </w:r>
     </w:p>
     <w:p>
@@ -271,7 +330,7 @@
           <w:rFonts w:ascii="Calibri" w:hAnsi="Calibri"/>
           <w:sz w:val="20"/>
         </w:rPr>
-        <w:t>4. Materialize historical feature data from an offline store to an online store.</w:t>
+        <w:t>4. Orchestrate container services using Docker Compose.</w:t>
       </w:r>
     </w:p>
     <w:p>
@@ -284,7 +343,7 @@
           <w:rFonts w:ascii="Calibri" w:hAnsi="Calibri"/>
           <w:sz w:val="20"/>
         </w:rPr>
-        <w:t>5. Retrieve online feature vectors via the Feast HTTP REST API for real-time model inference.</w:t>
+        <w:t>5. Materialize historical feature data from Parquet offline storage to SQLite online storage.</w:t>
       </w:r>
     </w:p>
     <w:p>
@@ -297,7 +356,33 @@
           <w:rFonts w:ascii="Calibri" w:hAnsi="Calibri"/>
           <w:sz w:val="20"/>
         </w:rPr>
-        <w:t>6. Validate feature definitions and metadata through the Feast Web UI dashboard.</w:t>
+        <w:t>6. Retrieve online feature vectors via the Feast HTTP REST API for real-time model inference.</w:t>
+      </w:r>
+    </w:p>
+    <w:p>
+      <w:pPr>
+        <w:spacing w:before="20" w:after="40"/>
+        <w:ind w:left="360"/>
+      </w:pPr>
+      <w:r>
+        <w:rPr>
+          <w:rFonts w:ascii="Calibri" w:hAnsi="Calibri"/>
+          <w:sz w:val="20"/>
+        </w:rPr>
+        <w:t>7. Inspect the underlying SQLite storage tables and verify data persistence on the host.</w:t>
+      </w:r>
+    </w:p>
+    <w:p>
+      <w:pPr>
+        <w:spacing w:before="20" w:after="40"/>
+        <w:ind w:left="360"/>
+      </w:pPr>
+      <w:r>
+        <w:rPr>
+          <w:rFonts w:ascii="Calibri" w:hAnsi="Calibri"/>
+          <w:sz w:val="20"/>
+        </w:rPr>
+        <w:t>8. Explore feature catalogs and metadata through the Feast Web UI dashboard.</w:t>
       </w:r>
     </w:p>
     <w:p>
@@ -363,7 +448,7 @@
           <w:color w:val="172B4D"/>
           <w:sz w:val="21"/>
         </w:rPr>
-        <w:t>Your task is to build a containerized local feature store using Feast, Parquet, and Redis. This system will serve as a reproducible foundation for feature management across development and production environments.</w:t>
+        <w:t>Your task is to build a containerized local feature store using Feast, Parquet, and SQLite. This system will serve as a reproducible foundation for feature management across development and production environments, storing all state on the host machine through Docker bind mounts without requiring external in-memory database engines.</w:t>
       </w:r>
     </w:p>
     <w:p>
@@ -592,7 +677,7 @@
               </w:rPr>
               <w:t>feast-docker-lab/</w:t>
               <w:br/>
-              <w:t>├── docker-compose.yml          # Multi-container orchestration (Redis, Feast Server, Feast UI)</w:t>
+              <w:t>├── docker-compose.yml          # Multi-container orchestration (Feast Server, Feast UI)</w:t>
               <w:br/>
               <w:t>├── Dockerfile                  # Feast custom runtime container definition</w:t>
               <w:br/>
@@ -600,11 +685,13 @@
               <w:br/>
               <w:t>├── entrypoint.sh               # Container startup and feature materialization script</w:t>
               <w:br/>
-              <w:t>├── test_client.py              # Script to query real-time online features from Redis</w:t>
+              <w:t>├── inspect_sqlite.py           # Verification script for SQLite storage inspection</w:t>
+              <w:br/>
+              <w:t>├── test_client.py              # Script to query real-time online features via REST</w:t>
               <w:br/>
               <w:t>└── feature_repo/</w:t>
               <w:br/>
-              <w:t xml:space="preserve">    ├── feature_store.yaml      # Central Feast storage configuration (Redis + File)</w:t>
+              <w:t xml:space="preserve">    ├── feature_store.yaml      # Central Feast storage configuration (SQLite + File)</w:t>
               <w:br/>
               <w:t xml:space="preserve">    ├── features.py             # Feature definitions (Entity, FileSource, FeatureView)</w:t>
               <w:br/>
@@ -614,7 +701,9 @@
               <w:br/>
               <w:t xml:space="preserve">        ├── driver_stats.parquet # Historical batch dataset (Offline store)</w:t>
               <w:br/>
-              <w:t xml:space="preserve">        └── registry.db         # Metadata registry database tracking schemas</w:t>
+              <w:t xml:space="preserve">        ├── registry.db         # Metadata registry database tracking schemas</w:t>
+              <w:br/>
+              <w:t xml:space="preserve">        └── online_store.db     # SQLite database for low-latency online serving</w:t>
             </w:r>
           </w:p>
         </w:tc>
@@ -644,7 +733,7 @@
           <w:color w:val="172B4D"/>
           <w:sz w:val="21"/>
         </w:rPr>
-        <w:t>You will configure Feast to persist metadata in a SQLite registry, read historical data from local Parquet files, and write online features to a containerized Redis instance.</w:t>
+        <w:t>You will configure Feast to persist metadata in a SQLite registry, read historical data from local Parquet files, and write online features directly to a local SQLite database stored on the host filesystem via a Docker bind mount.</w:t>
       </w:r>
     </w:p>
     <w:p>
@@ -658,7 +747,7 @@
           <w:color w:val="172B4D"/>
           <w:sz w:val="24"/>
         </w:rPr>
-        <w:t>1.3 Think First: Container Network Resolution</w:t>
+        <w:t>1.3 Think First: Embedded Storage vs Daemon Stores</w:t>
       </w:r>
     </w:p>
     <w:tbl>
@@ -699,7 +788,7 @@
                 <w:color w:val="0052CC"/>
                 <w:sz w:val="21"/>
               </w:rPr>
-              <w:t>Think First: Network Addressing</w:t>
+              <w:t>Think First: Storage Engine Selection</w:t>
               <w:br/>
             </w:r>
             <w:r>
@@ -708,10 +797,10 @@
                 <w:color w:val="172B4D"/>
                 <w:sz w:val="20"/>
               </w:rPr>
-              <w:t>Question: When Feast runs in a Docker container alongside a Redis container, what hostname should Feast use to connect to Redis?</w:t>
+              <w:t>Question: Why is SQLite chosen for local development and testing rather than a standalone database service?</w:t>
               <w:br/>
               <w:br/>
-              <w:t>Answer: Containers running in the same Docker bridge network communicate using service names defined in docker-compose.yml. Feast must connect to redis:6379, not localhost:6379, because localhost inside a container refers to the container itself.</w:t>
+              <w:t>Answer: SQLite is an embedded, serverless database engine that writes directly to disk files. It eliminates network configuration overhead, consumes minimal memory, and requires no auxiliary background daemon processes. For local developer environments, CI pipelines, and unit tests, SQLite provides full feature store functionality with zero infrastructure complexity.</w:t>
             </w:r>
           </w:p>
         </w:tc>
@@ -741,7 +830,7 @@
           <w:color w:val="172B4D"/>
           <w:sz w:val="21"/>
         </w:rPr>
-        <w:t>Create feature_repo/feature_store.yaml:</w:t>
+        <w:t>Create feature_repo/feature_store.yaml with SQLite online store configuration:</w:t>
       </w:r>
     </w:p>
     <w:tbl>
@@ -790,9 +879,9 @@
               <w:br/>
               <w:t>online_store:</w:t>
               <w:br/>
-              <w:t xml:space="preserve">  type: redis</w:t>
+              <w:t xml:space="preserve">  type: sqlite</w:t>
               <w:br/>
-              <w:t xml:space="preserve">  connection_string: redis:6379</w:t>
+              <w:t xml:space="preserve">  path: data/online_store.db</w:t>
               <w:br/>
               <w:t>offline_store:</w:t>
               <w:br/>
@@ -1131,9 +1220,9 @@
               </w:rPr>
               <w:t>[X] File feature_repo/feature_store.yaml is created.</w:t>
               <w:br/>
-              <w:t>[X] The connection_string points to redis:6379.</w:t>
+              <w:t>[X] The online_store.type is set to sqlite.</w:t>
               <w:br/>
-              <w:t>[X] You can explain why localhost will fail inside a containerized setup.</w:t>
+              <w:t>[X] The online_store.path points to data/online_store.db.</w:t>
             </w:r>
           </w:p>
         </w:tc>
@@ -1632,10 +1721,10 @@
                 <w:color w:val="172B4D"/>
                 <w:sz w:val="20"/>
               </w:rPr>
-              <w:t>Question: Why should registry updates (feast apply) occur inside the container entrypoint rather than during image build?</w:t>
+              <w:t>Question: Why should registry updates (feast apply) and materialization occur inside the container entrypoint rather than during image build?</w:t>
               <w:br/>
               <w:br/>
-              <w:t>Answer: During image build time, external dependencies like the Redis container and mounted volumes are unavailable. Executing feast apply and materialization at runtime ensures network connectivity to Redis and access to host-mounted configuration files.</w:t>
+              <w:t>Answer: During image build time, mounted host directories are unavailable. Executing feast apply and materialization at runtime ensures access to the host-mounted volume, allowing data/online_store.db and data/registry.db to persist directly on the host machine.</w:t>
             </w:r>
           </w:p>
         </w:tc>
@@ -1706,7 +1795,7 @@
                 <w:color w:val="172B4D"/>
                 <w:sz w:val="19"/>
               </w:rPr>
-              <w:t>feast[redis]==0.38.0</w:t>
+              <w:t>feast&gt;=0.38.0</w:t>
               <w:br/>
               <w:t>pandas&gt;=2.0.0</w:t>
               <w:br/>
@@ -1717,6 +1806,12 @@
               <w:t>uvicorn&gt;=0.22.0</w:t>
               <w:br/>
               <w:t>requests&gt;=2.31.0</w:t>
+              <w:br/>
+              <w:t>grpcio</w:t>
+              <w:br/>
+              <w:t>grpcio-health-checking</w:t>
+              <w:br/>
+              <w:t>grpcio-reflection</w:t>
             </w:r>
           </w:p>
         </w:tc>
@@ -1795,38 +1890,63 @@
               <w:t>cd /app</w:t>
               <w:br/>
               <w:br/>
+              <w:t>echo "=================================================="</w:t>
+              <w:br/>
+              <w:t>echo "Starting Feast Service Container"</w:t>
+              <w:br/>
+              <w:t>echo "=================================================="</w:t>
+              <w:br/>
+              <w:br/>
+              <w:t># 1. Generate Parquet data if missing</w:t>
+              <w:br/>
               <w:t>if [ ! -f "data/driver_stats.parquet" ]; then</w:t>
               <w:br/>
-              <w:t xml:space="preserve">    echo "Dataset not found. Generating sample data..."</w:t>
+              <w:t xml:space="preserve">    echo "Parquet data not found. Generating synthetic dataset..."</w:t>
               <w:br/>
               <w:t xml:space="preserve">    python3 generate_data.py</w:t>
               <w:br/>
+              <w:t>else</w:t>
+              <w:br/>
+              <w:t xml:space="preserve">    echo "Found existing Parquet dataset."</w:t>
+              <w:br/>
               <w:t>fi</w:t>
               <w:br/>
+              <w:br/>
+              <w:t># 2. Register Feature Store definitions</w:t>
               <w:br/>
               <w:t>echo "Applying feature definitions to registry..."</w:t>
               <w:br/>
               <w:t>feast apply</w:t>
               <w:br/>
               <w:br/>
+              <w:t># 3. Materialize features into SQLite if requested</w:t>
+              <w:br/>
               <w:t>if [ "${MATERIALIZE:-false}" = "true" ]; then</w:t>
               <w:br/>
-              <w:t xml:space="preserve">    echo "Materializing features to Redis online store..."</w:t>
+              <w:t xml:space="preserve">    echo "Materializing features to SQLite online store..."</w:t>
               <w:br/>
               <w:t xml:space="preserve">    feast materialize-incremental "$(date -u +"%Y-%m-%dT%H:%M:%S")"</w:t>
+              <w:br/>
+              <w:t xml:space="preserve">    echo "Materialization complete."</w:t>
               <w:br/>
               <w:t>fi</w:t>
               <w:br/>
               <w:br/>
+              <w:t># 4. Route commands</w:t>
+              <w:br/>
               <w:t>case "$1" in</w:t>
               <w:br/>
               <w:t xml:space="preserve">    "serve")</w:t>
+              <w:br/>
+              <w:t xml:space="preserve">        echo "Launching Feast Feature Server on 0.0.0.0:6566..."</w:t>
               <w:br/>
               <w:t xml:space="preserve">        exec feast serve -h 0.0.0.0 -p 6566</w:t>
               <w:br/>
               <w:t xml:space="preserve">        ;;</w:t>
               <w:br/>
               <w:t xml:space="preserve">    "ui")</w:t>
+              <w:br/>
+              <w:t xml:space="preserve">        echo "Launching Feast Web Dashboard on 0.0.0.0:8888..."</w:t>
               <w:br/>
               <w:t xml:space="preserve">        exec feast ui -h 0.0.0.0 -p 8888</w:t>
               <w:br/>
@@ -1935,7 +2055,9 @@
               <w:br/>
               <w:t>COPY requirements.txt .</w:t>
               <w:br/>
-              <w:t>RUN pip install --no-cache-dir -r requirements.txt</w:t>
+              <w:t>RUN pip install --no-cache-dir --upgrade pip &amp;&amp; \</w:t>
+              <w:br/>
+              <w:t xml:space="preserve">    pip install --no-cache-dir -r requirements.txt</w:t>
               <w:br/>
               <w:br/>
               <w:t>COPY feature_repo/ /app/</w:t>
@@ -1978,7 +2100,7 @@
           <w:color w:val="172B4D"/>
           <w:sz w:val="21"/>
         </w:rPr>
-        <w:t>Running a feature store requires multiple decoupled components: a database for the online store, an API server for inference queries, and an administrative user interface.</w:t>
+        <w:t>Running a complete local feature store platform involves two core interfaces: an API server for low-latency feature serving, and an interactive web user interface for catalog discovery.</w:t>
       </w:r>
     </w:p>
     <w:p>
@@ -2005,7 +2127,7 @@
           <w:color w:val="172B4D"/>
           <w:sz w:val="21"/>
         </w:rPr>
-        <w:t>You will construct a docker-compose.yml file defining services for redis, feast-server, and feast-ui using shared networks and container health checks.</w:t>
+        <w:t>You will construct a docker-compose.yml file defining services for feast-server and feast-ui using a shared network and host bind mount.</w:t>
       </w:r>
     </w:p>
     <w:p>
@@ -2019,7 +2141,7 @@
           <w:color w:val="172B4D"/>
           <w:sz w:val="24"/>
         </w:rPr>
-        <w:t>4.2 Think First: Container Dependencies</w:t>
+        <w:t>4.2 Think First: Bind Mount Persistence</w:t>
       </w:r>
     </w:p>
     <w:tbl>
@@ -2060,7 +2182,7 @@
                 <w:color w:val="0052CC"/>
                 <w:sz w:val="21"/>
               </w:rPr>
-              <w:t>Think First: Health Checks</w:t>
+              <w:t>Think First: Storage Persistence</w:t>
               <w:br/>
             </w:r>
             <w:r>
@@ -2069,10 +2191,10 @@
                 <w:color w:val="172B4D"/>
                 <w:sz w:val="20"/>
               </w:rPr>
-              <w:t>Question: Why is a simple depends_on: [redis] block insufficient for the feast-server container?</w:t>
+              <w:t>Question: How does mounting ./feature_repo:/app solve data persistence across container updates?</w:t>
               <w:br/>
               <w:br/>
-              <w:t>Answer: Standard depends_on only waits until the target container starts, not until the database process inside is ready to accept connections. Using condition: service_healthy ensures Redis is answering PING requests before Feast begins materialization.</w:t>
+              <w:t>Answer: Container filesystems are ephemeral by default. When ./feature_repo:/app is bind-mounted, any writes made by Feast to /app/data/online_store.db or /app/data/registry.db are written directly to the host machine disk. Even if containers are destroyed with docker compose down, all materialized features remain intact on the host.</w:t>
             </w:r>
           </w:p>
         </w:tc>
@@ -2145,36 +2267,7 @@
               </w:rPr>
               <w:t>services:</w:t>
               <w:br/>
-              <w:t xml:space="preserve">  redis:</w:t>
-              <w:br/>
-              <w:t xml:space="preserve">    image: redis:7.2-alpine</w:t>
-              <w:br/>
-              <w:t xml:space="preserve">    container_name: feast-redis</w:t>
-              <w:br/>
-              <w:t xml:space="preserve">    ports:</w:t>
-              <w:br/>
-              <w:t xml:space="preserve">      - "6379:6379"</w:t>
-              <w:br/>
-              <w:t xml:space="preserve">    volumes:</w:t>
-              <w:br/>
-              <w:t xml:space="preserve">      - redis-storage:/data</w:t>
-              <w:br/>
-              <w:t xml:space="preserve">    networks:</w:t>
-              <w:br/>
-              <w:t xml:space="preserve">      - feast-net</w:t>
-              <w:br/>
-              <w:t xml:space="preserve">    healthcheck:</w:t>
-              <w:br/>
-              <w:t xml:space="preserve">      test: ["CMD", "redis-cli", "ping"]</w:t>
-              <w:br/>
-              <w:t xml:space="preserve">      interval: 3s</w:t>
-              <w:br/>
-              <w:t xml:space="preserve">      timeout: 2s</w:t>
-              <w:br/>
-              <w:t xml:space="preserve">      retries: 5</w:t>
-              <w:br/>
-              <w:t xml:space="preserve">    restart: unless-stopped</w:t>
-              <w:br/>
+              <w:t xml:space="preserve">  # 1. Feast Feature Server (REST Serving API)</w:t>
               <w:br/>
               <w:t xml:space="preserve">  feast-server:</w:t>
               <w:br/>
@@ -2200,18 +2293,14 @@
               <w:br/>
               <w:t xml:space="preserve">      - ./feature_repo:/app</w:t>
               <w:br/>
-              <w:t xml:space="preserve">    depends_on:</w:t>
-              <w:br/>
-              <w:t xml:space="preserve">      redis:</w:t>
-              <w:br/>
-              <w:t xml:space="preserve">        condition: service_healthy</w:t>
-              <w:br/>
               <w:t xml:space="preserve">    networks:</w:t>
               <w:br/>
               <w:t xml:space="preserve">      - feast-net</w:t>
               <w:br/>
               <w:t xml:space="preserve">    restart: unless-stopped</w:t>
               <w:br/>
+              <w:br/>
+              <w:t xml:space="preserve">  # 2. Feast Web UI (Catalog Dashboard)</w:t>
               <w:br/>
               <w:t xml:space="preserve">  feast-ui:</w:t>
               <w:br/>
@@ -2237,12 +2326,6 @@
               <w:br/>
               <w:t xml:space="preserve">      - ./feature_repo:/app</w:t>
               <w:br/>
-              <w:t xml:space="preserve">    depends_on:</w:t>
-              <w:br/>
-              <w:t xml:space="preserve">      redis:</w:t>
-              <w:br/>
-              <w:t xml:space="preserve">        condition: service_healthy</w:t>
-              <w:br/>
               <w:t xml:space="preserve">    networks:</w:t>
               <w:br/>
               <w:t xml:space="preserve">      - feast-net</w:t>
@@ -2255,11 +2338,6 @@
               <w:t xml:space="preserve">  feast-net:</w:t>
               <w:br/>
               <w:t xml:space="preserve">    driver: bridge</w:t>
-              <w:br/>
-              <w:br/>
-              <w:t>volumes:</w:t>
-              <w:br/>
-              <w:t xml:space="preserve">  redis-storage:</w:t>
             </w:r>
           </w:p>
         </w:tc>
@@ -2336,62 +2414,6 @@
         </w:tc>
       </w:tr>
     </w:tbl>
-    <w:tbl>
-      <w:tblPr>
-        <w:tblW w:type="auto" w:w="0"/>
-        <w:jc w:val="center"/>
-        <w:tblLook w:firstColumn="1" w:firstRow="1" w:lastColumn="0" w:lastRow="0" w:noHBand="0" w:noVBand="1" w:val="04A0"/>
-      </w:tblPr>
-      <w:tblGrid>
-        <w:gridCol w:w="9936"/>
-      </w:tblGrid>
-      <w:tr>
-        <w:tc>
-          <w:tcPr>
-            <w:tcW w:type="dxa" w:w="9360"/>
-            <w:shd w:fill="EBF3FC"/>
-            <w:tcMar>
-              <w:top w:w="140" w:type="dxa"/>
-              <w:bottom w:w="140" w:type="dxa"/>
-              <w:left w:w="180" w:type="dxa"/>
-              <w:right w:w="180" w:type="dxa"/>
-            </w:tcMar>
-            <w:tcBorders>
-              <w:top w:val="single" w:sz="4" w:space="0" w:color="CCE0F5"/>
-              <w:left w:val="single" w:sz="24" w:space="0" w:color="0052CC"/>
-              <w:bottom w:val="single" w:sz="4" w:space="0" w:color="CCE0F5"/>
-              <w:right w:val="single" w:sz="4" w:space="0" w:color="CCE0F5"/>
-            </w:tcBorders>
-          </w:tcPr>
-          <w:p>
-            <w:pPr>
-              <w:spacing w:before="40" w:after="80"/>
-            </w:pPr>
-            <w:r>
-              <w:rPr>
-                <w:rFonts w:ascii="Calibri" w:hAnsi="Calibri"/>
-                <w:b/>
-                <w:color w:val="0052CC"/>
-                <w:sz w:val="21"/>
-              </w:rPr>
-              <w:t>Prediction Exercise</w:t>
-              <w:br/>
-            </w:r>
-            <w:r>
-              <w:rPr>
-                <w:rFonts w:ascii="Calibri" w:hAnsi="Calibri"/>
-                <w:color w:val="172B4D"/>
-                <w:sz w:val="20"/>
-              </w:rPr>
-              <w:t>Predict: What status will docker compose ps report for the Redis container when healthy?</w:t>
-              <w:br/>
-              <w:br/>
-              <w:t>Verification: The status column will display Up (healthy).</w:t>
-            </w:r>
-          </w:p>
-        </w:tc>
-      </w:tr>
-    </w:tbl>
     <w:p>
       <w:pPr>
         <w:spacing w:before="40" w:after="80" w:line="276" w:lineRule="auto"/>
@@ -2457,8 +2479,8 @@
       <w:r>
         <w:drawing>
           <wp:inline xmlns:a="http://schemas.openxmlformats.org/drawingml/2006/main" xmlns:pic="http://schemas.openxmlformats.org/drawingml/2006/picture">
-            <wp:extent cx="5669280" cy="452948"/>
-            <wp:docPr id="2" name="Picture 2"/>
+            <wp:extent cx="5669280" cy="692912"/>
+            <wp:docPr id="3" name="Picture 3"/>
             <wp:cNvGraphicFramePr>
               <a:graphicFrameLocks noChangeAspect="1"/>
             </wp:cNvGraphicFramePr>
@@ -2470,7 +2492,7 @@
                     <pic:cNvPicPr/>
                   </pic:nvPicPr>
                   <pic:blipFill>
-                    <a:blip r:embed="rId10"/>
+                    <a:blip r:embed="rId11"/>
                     <a:stretch>
                       <a:fillRect/>
                     </a:stretch>
@@ -2478,7 +2500,7 @@
                   <pic:spPr>
                     <a:xfrm>
                       <a:off x="0" y="0"/>
-                      <a:ext cx="5669280" cy="452948"/>
+                      <a:ext cx="5669280" cy="692912"/>
                     </a:xfrm>
                     <a:prstGeom prst="rect"/>
                   </pic:spPr>
@@ -2501,7 +2523,7 @@
           <w:color w:val="6B778C"/>
           <w:sz w:val="19"/>
         </w:rPr>
-        <w:t>Screenshot 1: Docker Compose Multi-Container Status</w:t>
+        <w:t>Figure 3: Docker Compose Service Status</w:t>
       </w:r>
     </w:p>
     <w:p>
@@ -2514,7 +2536,7 @@
           <w:color w:val="172B4D"/>
           <w:sz w:val="21"/>
         </w:rPr>
-        <w:t>Inspect server startup logs:</w:t>
+        <w:t>Inspect server startup and feature materialization logs:</w:t>
       </w:r>
     </w:p>
     <w:tbl>
@@ -2569,8 +2591,8 @@
       <w:r>
         <w:drawing>
           <wp:inline xmlns:a="http://schemas.openxmlformats.org/drawingml/2006/main" xmlns:pic="http://schemas.openxmlformats.org/drawingml/2006/picture">
-            <wp:extent cx="5669280" cy="1948815"/>
-            <wp:docPr id="3" name="Picture 3"/>
+            <wp:extent cx="5669280" cy="2627588"/>
+            <wp:docPr id="4" name="Picture 4"/>
             <wp:cNvGraphicFramePr>
               <a:graphicFrameLocks noChangeAspect="1"/>
             </wp:cNvGraphicFramePr>
@@ -2582,7 +2604,7 @@
                     <pic:cNvPicPr/>
                   </pic:nvPicPr>
                   <pic:blipFill>
-                    <a:blip r:embed="rId11"/>
+                    <a:blip r:embed="rId12"/>
                     <a:stretch>
                       <a:fillRect/>
                     </a:stretch>
@@ -2590,7 +2612,7 @@
                   <pic:spPr>
                     <a:xfrm>
                       <a:off x="0" y="0"/>
-                      <a:ext cx="5669280" cy="1948815"/>
+                      <a:ext cx="5669280" cy="2627588"/>
                     </a:xfrm>
                     <a:prstGeom prst="rect"/>
                   </pic:spPr>
@@ -2613,21 +2635,7 @@
           <w:color w:val="6B778C"/>
           <w:sz w:val="19"/>
         </w:rPr>
-        <w:t>Screenshot 2: Feast Server Startup and Materialization Logs</w:t>
-      </w:r>
-    </w:p>
-    <w:p>
-      <w:pPr>
-        <w:spacing w:before="280" w:after="80"/>
-      </w:pPr>
-      <w:r>
-        <w:rPr>
-          <w:rFonts w:ascii="Calibri" w:hAnsi="Calibri"/>
-          <w:b/>
-          <w:color w:val="0052CC"/>
-          <w:sz w:val="30"/>
-        </w:rPr>
-        <w:t>Chapter 5: Real-Time Feature Ingestion and Serving</w:t>
+        <w:t>Figure 4: Feast Server Startup and Materialization Logs</w:t>
       </w:r>
     </w:p>
     <w:p>
@@ -2640,135 +2648,7 @@
           <w:color w:val="172B4D"/>
           <w:sz w:val="21"/>
         </w:rPr>
-        <w:t>With services active and features materialized into Redis, client applications can query feature vectors using the Feast REST API.</w:t>
-      </w:r>
-    </w:p>
-    <w:p>
-      <w:pPr>
-        <w:spacing w:before="200" w:after="40"/>
-      </w:pPr>
-      <w:r>
-        <w:rPr>
-          <w:rFonts w:ascii="Calibri" w:hAnsi="Calibri"/>
-          <w:b/>
-          <w:color w:val="172B4D"/>
-          <w:sz w:val="24"/>
-        </w:rPr>
-        <w:t>5.1 What You Will Build</w:t>
-      </w:r>
-    </w:p>
-    <w:p>
-      <w:pPr>
-        <w:spacing w:before="40" w:after="80" w:line="276" w:lineRule="auto"/>
-      </w:pPr>
-      <w:r>
-        <w:rPr>
-          <w:rFonts w:ascii="Calibri" w:hAnsi="Calibri"/>
-          <w:color w:val="172B4D"/>
-          <w:sz w:val="21"/>
-        </w:rPr>
-        <w:t>You will query the Feast feature server using curl, build a Python test client, and explore the Feast Web UI dashboard.</w:t>
-      </w:r>
-    </w:p>
-    <w:p>
-      <w:pPr>
-        <w:spacing w:before="200" w:after="40"/>
-      </w:pPr>
-      <w:r>
-        <w:rPr>
-          <w:rFonts w:ascii="Calibri" w:hAnsi="Calibri"/>
-          <w:b/>
-          <w:color w:val="172B4D"/>
-          <w:sz w:val="24"/>
-        </w:rPr>
-        <w:t>5.2 Think First: Query Payloads</w:t>
-      </w:r>
-    </w:p>
-    <w:tbl>
-      <w:tblPr>
-        <w:tblW w:type="auto" w:w="0"/>
-        <w:jc w:val="center"/>
-        <w:tblLook w:firstColumn="1" w:firstRow="1" w:lastColumn="0" w:lastRow="0" w:noHBand="0" w:noVBand="1" w:val="04A0"/>
-      </w:tblPr>
-      <w:tblGrid>
-        <w:gridCol w:w="9936"/>
-      </w:tblGrid>
-      <w:tr>
-        <w:tc>
-          <w:tcPr>
-            <w:tcW w:type="dxa" w:w="9360"/>
-            <w:shd w:fill="EBF3FC"/>
-            <w:tcMar>
-              <w:top w:w="140" w:type="dxa"/>
-              <w:bottom w:w="140" w:type="dxa"/>
-              <w:left w:w="180" w:type="dxa"/>
-              <w:right w:w="180" w:type="dxa"/>
-            </w:tcMar>
-            <w:tcBorders>
-              <w:top w:val="single" w:sz="4" w:space="0" w:color="CCE0F5"/>
-              <w:left w:val="single" w:sz="24" w:space="0" w:color="0052CC"/>
-              <w:bottom w:val="single" w:sz="4" w:space="0" w:color="CCE0F5"/>
-              <w:right w:val="single" w:sz="4" w:space="0" w:color="CCE0F5"/>
-            </w:tcBorders>
-          </w:tcPr>
-          <w:p>
-            <w:pPr>
-              <w:spacing w:before="40" w:after="80"/>
-            </w:pPr>
-            <w:r>
-              <w:rPr>
-                <w:rFonts w:ascii="Calibri" w:hAnsi="Calibri"/>
-                <w:b/>
-                <w:color w:val="0052CC"/>
-                <w:sz w:val="21"/>
-              </w:rPr>
-              <w:t>Think First: Online Query Structure</w:t>
-              <w:br/>
-            </w:r>
-            <w:r>
-              <w:rPr>
-                <w:rFonts w:ascii="Calibri" w:hAnsi="Calibri"/>
-                <w:color w:val="172B4D"/>
-                <w:sz w:val="20"/>
-              </w:rPr>
-              <w:t>Question: What two payload attributes are mandatory when sending a POST request to /get-online-features?</w:t>
-              <w:br/>
-              <w:br/>
-              <w:t>Answer:</w:t>
-              <w:br/>
-              <w:t>1. features: A list of feature strings formatted as feature_view_name:feature_name.</w:t>
-              <w:br/>
-              <w:t>2. entities: A dictionary mapping entity join keys to lists of entity IDs.</w:t>
-            </w:r>
-          </w:p>
-        </w:tc>
-      </w:tr>
-    </w:tbl>
-    <w:p>
-      <w:pPr>
-        <w:spacing w:before="200" w:after="40"/>
-      </w:pPr>
-      <w:r>
-        <w:rPr>
-          <w:rFonts w:ascii="Calibri" w:hAnsi="Calibri"/>
-          <w:b/>
-          <w:color w:val="172B4D"/>
-          <w:sz w:val="24"/>
-        </w:rPr>
-        <w:t>5.3 Test with cURL</w:t>
-      </w:r>
-    </w:p>
-    <w:p>
-      <w:pPr>
-        <w:spacing w:before="40" w:after="80" w:line="276" w:lineRule="auto"/>
-      </w:pPr>
-      <w:r>
-        <w:rPr>
-          <w:rFonts w:ascii="Calibri" w:hAnsi="Calibri"/>
-          <w:color w:val="172B4D"/>
-          <w:sz w:val="21"/>
-        </w:rPr>
-        <w:t>Send an HTTP request to retrieve feature values for driver IDs 1001 and 1002:</w:t>
+        <w:t>Verify file persistence on the host machine filesystem:</w:t>
       </w:r>
     </w:p>
     <w:tbl>
@@ -2809,34 +2689,206 @@
                 <w:color w:val="172B4D"/>
                 <w:sz w:val="19"/>
               </w:rPr>
-              <w:t>curl -X POST http://localhost:6566/get-online-features \</w:t>
-              <w:br/>
-              <w:t xml:space="preserve">  -H "Content-Type: application/json" \</w:t>
-              <w:br/>
-              <w:t xml:space="preserve">  -d '{</w:t>
-              <w:br/>
-              <w:t xml:space="preserve">    "features": [</w:t>
-              <w:br/>
-              <w:t xml:space="preserve">      "driver_hourly_stats:conv_rate",</w:t>
-              <w:br/>
-              <w:t xml:space="preserve">      "driver_hourly_stats:acc_rate",</w:t>
-              <w:br/>
-              <w:t xml:space="preserve">      "driver_hourly_stats:avg_daily_trips"</w:t>
-              <w:br/>
-              <w:t xml:space="preserve">    ],</w:t>
-              <w:br/>
-              <w:t xml:space="preserve">    "entities": {</w:t>
-              <w:br/>
-              <w:t xml:space="preserve">      "driver_id": [1001, 1002]</w:t>
-              <w:br/>
-              <w:t xml:space="preserve">    }</w:t>
-              <w:br/>
-              <w:t xml:space="preserve">  }'</w:t>
+              <w:t>Get-ChildItem feature_repo\data</w:t>
             </w:r>
           </w:p>
         </w:tc>
       </w:tr>
     </w:tbl>
+    <w:p>
+      <w:pPr>
+        <w:spacing w:before="160" w:after="40"/>
+        <w:jc w:val="center"/>
+      </w:pPr>
+      <w:r>
+        <w:drawing>
+          <wp:inline xmlns:a="http://schemas.openxmlformats.org/drawingml/2006/main" xmlns:pic="http://schemas.openxmlformats.org/drawingml/2006/picture">
+            <wp:extent cx="5669280" cy="1380346"/>
+            <wp:docPr id="5" name="Picture 5"/>
+            <wp:cNvGraphicFramePr>
+              <a:graphicFrameLocks noChangeAspect="1"/>
+            </wp:cNvGraphicFramePr>
+            <a:graphic>
+              <a:graphicData uri="http://schemas.openxmlformats.org/drawingml/2006/picture">
+                <pic:pic>
+                  <pic:nvPicPr>
+                    <pic:cNvPr id="0" name="ss3_host_data_files.png"/>
+                    <pic:cNvPicPr/>
+                  </pic:nvPicPr>
+                  <pic:blipFill>
+                    <a:blip r:embed="rId13"/>
+                    <a:stretch>
+                      <a:fillRect/>
+                    </a:stretch>
+                  </pic:blipFill>
+                  <pic:spPr>
+                    <a:xfrm>
+                      <a:off x="0" y="0"/>
+                      <a:ext cx="5669280" cy="1380346"/>
+                    </a:xfrm>
+                    <a:prstGeom prst="rect"/>
+                  </pic:spPr>
+                </pic:pic>
+              </a:graphicData>
+            </a:graphic>
+          </wp:inline>
+        </w:drawing>
+      </w:r>
+    </w:p>
+    <w:p>
+      <w:pPr>
+        <w:spacing w:before="40" w:after="160"/>
+        <w:jc w:val="center"/>
+      </w:pPr>
+      <w:r>
+        <w:rPr>
+          <w:rFonts w:ascii="Calibri" w:hAnsi="Calibri"/>
+          <w:i/>
+          <w:color w:val="6B778C"/>
+          <w:sz w:val="19"/>
+        </w:rPr>
+        <w:t>Figure 5: Host Storage File Verification</w:t>
+      </w:r>
+    </w:p>
+    <w:p>
+      <w:pPr>
+        <w:spacing w:before="40" w:after="80" w:line="276" w:lineRule="auto"/>
+      </w:pPr>
+      <w:r>
+        <w:rPr>
+          <w:rFonts w:ascii="Calibri" w:hAnsi="Calibri"/>
+          <w:color w:val="172B4D"/>
+          <w:sz w:val="21"/>
+        </w:rPr>
+        <w:t>Inspect the SQLite online store directly on the host using Python:</w:t>
+      </w:r>
+    </w:p>
+    <w:tbl>
+      <w:tblPr>
+        <w:tblW w:type="auto" w:w="0"/>
+        <w:jc w:val="center"/>
+        <w:tblLayout w:type="fixed"/>
+        <w:tblLook w:firstColumn="1" w:firstRow="1" w:lastColumn="0" w:lastRow="0" w:noHBand="0" w:noVBand="1" w:val="04A0"/>
+      </w:tblPr>
+      <w:tblGrid>
+        <w:gridCol w:w="9936"/>
+      </w:tblGrid>
+      <w:tr>
+        <w:tc>
+          <w:tcPr>
+            <w:tcW w:type="dxa" w:w="9360"/>
+            <w:shd w:fill="F4F5F7"/>
+            <w:tcMar>
+              <w:top w:w="120" w:type="dxa"/>
+              <w:bottom w:w="120" w:type="dxa"/>
+              <w:left w:w="180" w:type="dxa"/>
+              <w:right w:w="180" w:type="dxa"/>
+            </w:tcMar>
+            <w:tcBorders>
+              <w:top w:val="single" w:sz="4" w:space="0" w:color="E2E4E8"/>
+              <w:left w:val="single" w:sz="18" w:space="0" w:color="0052CC"/>
+              <w:bottom w:val="single" w:sz="4" w:space="0" w:color="E2E4E8"/>
+              <w:right w:val="single" w:sz="4" w:space="0" w:color="E2E4E8"/>
+            </w:tcBorders>
+          </w:tcPr>
+          <w:p>
+            <w:pPr>
+              <w:spacing w:before="40" w:after="40" w:line="276" w:lineRule="auto"/>
+            </w:pPr>
+            <w:r>
+              <w:rPr>
+                <w:rFonts w:ascii="Consolas" w:hAnsi="Consolas"/>
+                <w:color w:val="172B4D"/>
+                <w:sz w:val="19"/>
+              </w:rPr>
+              <w:t>python inspect_sqlite.py</w:t>
+            </w:r>
+          </w:p>
+        </w:tc>
+      </w:tr>
+    </w:tbl>
+    <w:p>
+      <w:pPr>
+        <w:spacing w:before="160" w:after="40"/>
+        <w:jc w:val="center"/>
+      </w:pPr>
+      <w:r>
+        <w:drawing>
+          <wp:inline xmlns:a="http://schemas.openxmlformats.org/drawingml/2006/main" xmlns:pic="http://schemas.openxmlformats.org/drawingml/2006/picture">
+            <wp:extent cx="5669280" cy="926804"/>
+            <wp:docPr id="6" name="Picture 6"/>
+            <wp:cNvGraphicFramePr>
+              <a:graphicFrameLocks noChangeAspect="1"/>
+            </wp:cNvGraphicFramePr>
+            <a:graphic>
+              <a:graphicData uri="http://schemas.openxmlformats.org/drawingml/2006/picture">
+                <pic:pic>
+                  <pic:nvPicPr>
+                    <pic:cNvPr id="0" name="ss4_sqlite_inspection.png"/>
+                    <pic:cNvPicPr/>
+                  </pic:nvPicPr>
+                  <pic:blipFill>
+                    <a:blip r:embed="rId14"/>
+                    <a:stretch>
+                      <a:fillRect/>
+                    </a:stretch>
+                  </pic:blipFill>
+                  <pic:spPr>
+                    <a:xfrm>
+                      <a:off x="0" y="0"/>
+                      <a:ext cx="5669280" cy="926804"/>
+                    </a:xfrm>
+                    <a:prstGeom prst="rect"/>
+                  </pic:spPr>
+                </pic:pic>
+              </a:graphicData>
+            </a:graphic>
+          </wp:inline>
+        </w:drawing>
+      </w:r>
+    </w:p>
+    <w:p>
+      <w:pPr>
+        <w:spacing w:before="40" w:after="160"/>
+        <w:jc w:val="center"/>
+      </w:pPr>
+      <w:r>
+        <w:rPr>
+          <w:rFonts w:ascii="Calibri" w:hAnsi="Calibri"/>
+          <w:i/>
+          <w:color w:val="6B778C"/>
+          <w:sz w:val="19"/>
+        </w:rPr>
+        <w:t>Figure 6: Direct SQLite Database Inspection</w:t>
+      </w:r>
+    </w:p>
+    <w:p>
+      <w:pPr>
+        <w:spacing w:before="280" w:after="80"/>
+      </w:pPr>
+      <w:r>
+        <w:rPr>
+          <w:rFonts w:ascii="Calibri" w:hAnsi="Calibri"/>
+          <w:b/>
+          <w:color w:val="0052CC"/>
+          <w:sz w:val="30"/>
+        </w:rPr>
+        <w:t>Chapter 5: Real-Time Feature Ingestion and Serving</w:t>
+      </w:r>
+    </w:p>
+    <w:p>
+      <w:pPr>
+        <w:spacing w:before="40" w:after="80" w:line="276" w:lineRule="auto"/>
+      </w:pPr>
+      <w:r>
+        <w:rPr>
+          <w:rFonts w:ascii="Calibri" w:hAnsi="Calibri"/>
+          <w:color w:val="172B4D"/>
+          <w:sz w:val="21"/>
+        </w:rPr>
+        <w:t>With services active and features materialized into SQLite, client applications can query feature vectors using the Feast REST API or direct SQL queries.</w:t>
+      </w:r>
+    </w:p>
     <w:p>
       <w:pPr>
         <w:spacing w:before="200" w:after="40"/>
@@ -2848,7 +2900,7 @@
           <w:color w:val="172B4D"/>
           <w:sz w:val="24"/>
         </w:rPr>
-        <w:t>5.4 Test with Python Client</w:t>
+        <w:t>5.1 Test with Python Client</w:t>
       </w:r>
     </w:p>
     <w:p>
@@ -2908,7 +2960,7 @@
               <w:t>FEAST_URL = "http://localhost:6566/get-online-features"</w:t>
               <w:br/>
               <w:br/>
-              <w:t>payload = {</w:t>
+              <w:t>request_payload = {</w:t>
               <w:br/>
               <w:t xml:space="preserve">    "features": [</w:t>
               <w:br/>
@@ -2929,12 +2981,16 @@
               <w:t>}</w:t>
               <w:br/>
               <w:br/>
-              <w:t>response = requests.post(FEAST_URL, json=payload)</w:t>
+              <w:t>response = requests.post(FEAST_URL, json=request_payload, timeout=5)</w:t>
               <w:br/>
               <w:t>data = response.json()</w:t>
               <w:br/>
               <w:t>cols = [r["values"] for r in data.get("results", [])]</w:t>
               <w:br/>
+              <w:br/>
+              <w:t>print("Connected successfully. Features retrieved from SQLite online store:")</w:t>
+              <w:br/>
+              <w:t>print("=" * 65)</w:t>
               <w:br/>
               <w:t>print(f"{'DRIVER ID':&lt;12} | {'CONV RATE':&lt;12} | {'ACC RATE':&lt;12} | {'DAILY TRIPS':&lt;12}")</w:t>
               <w:br/>
@@ -2956,14 +3012,71 @@
     </w:tbl>
     <w:p>
       <w:pPr>
+        <w:spacing w:before="40" w:after="80" w:line="276" w:lineRule="auto"/>
+      </w:pPr>
+      <w:r>
+        <w:rPr>
+          <w:rFonts w:ascii="Calibri" w:hAnsi="Calibri"/>
+          <w:color w:val="172B4D"/>
+          <w:sz w:val="21"/>
+        </w:rPr>
+        <w:t>Execute the test client:</w:t>
+      </w:r>
+    </w:p>
+    <w:tbl>
+      <w:tblPr>
+        <w:tblW w:type="auto" w:w="0"/>
+        <w:jc w:val="center"/>
+        <w:tblLayout w:type="fixed"/>
+        <w:tblLook w:firstColumn="1" w:firstRow="1" w:lastColumn="0" w:lastRow="0" w:noHBand="0" w:noVBand="1" w:val="04A0"/>
+      </w:tblPr>
+      <w:tblGrid>
+        <w:gridCol w:w="9936"/>
+      </w:tblGrid>
+      <w:tr>
+        <w:tc>
+          <w:tcPr>
+            <w:tcW w:type="dxa" w:w="9360"/>
+            <w:shd w:fill="F4F5F7"/>
+            <w:tcMar>
+              <w:top w:w="120" w:type="dxa"/>
+              <w:bottom w:w="120" w:type="dxa"/>
+              <w:left w:w="180" w:type="dxa"/>
+              <w:right w:w="180" w:type="dxa"/>
+            </w:tcMar>
+            <w:tcBorders>
+              <w:top w:val="single" w:sz="4" w:space="0" w:color="E2E4E8"/>
+              <w:left w:val="single" w:sz="18" w:space="0" w:color="0052CC"/>
+              <w:bottom w:val="single" w:sz="4" w:space="0" w:color="E2E4E8"/>
+              <w:right w:val="single" w:sz="4" w:space="0" w:color="E2E4E8"/>
+            </w:tcBorders>
+          </w:tcPr>
+          <w:p>
+            <w:pPr>
+              <w:spacing w:before="40" w:after="40" w:line="276" w:lineRule="auto"/>
+            </w:pPr>
+            <w:r>
+              <w:rPr>
+                <w:rFonts w:ascii="Consolas" w:hAnsi="Consolas"/>
+                <w:color w:val="172B4D"/>
+                <w:sz w:val="19"/>
+              </w:rPr>
+              <w:t>python test_client.py</w:t>
+            </w:r>
+          </w:p>
+        </w:tc>
+      </w:tr>
+    </w:tbl>
+    <w:p>
+      <w:pPr>
         <w:spacing w:before="160" w:after="40"/>
         <w:jc w:val="center"/>
       </w:pPr>
       <w:r>
         <w:drawing>
           <wp:inline xmlns:a="http://schemas.openxmlformats.org/drawingml/2006/main" xmlns:pic="http://schemas.openxmlformats.org/drawingml/2006/picture">
-            <wp:extent cx="5669280" cy="1450538"/>
-            <wp:docPr id="4" name="Picture 4"/>
+            <wp:extent cx="5669280" cy="1720503"/>
+            <wp:docPr id="7" name="Picture 7"/>
             <wp:cNvGraphicFramePr>
               <a:graphicFrameLocks noChangeAspect="1"/>
             </wp:cNvGraphicFramePr>
@@ -2971,11 +3084,11 @@
               <a:graphicData uri="http://schemas.openxmlformats.org/drawingml/2006/picture">
                 <pic:pic>
                   <pic:nvPicPr>
-                    <pic:cNvPr id="0" name="ss3_python_client_output.png"/>
+                    <pic:cNvPr id="0" name="ss5_python_client_output.png"/>
                     <pic:cNvPicPr/>
                   </pic:nvPicPr>
                   <pic:blipFill>
-                    <a:blip r:embed="rId12"/>
+                    <a:blip r:embed="rId15"/>
                     <a:stretch>
                       <a:fillRect/>
                     </a:stretch>
@@ -2983,7 +3096,7 @@
                   <pic:spPr>
                     <a:xfrm>
                       <a:off x="0" y="0"/>
-                      <a:ext cx="5669280" cy="1450538"/>
+                      <a:ext cx="5669280" cy="1720503"/>
                     </a:xfrm>
                     <a:prstGeom prst="rect"/>
                   </pic:spPr>
@@ -3006,7 +3119,7 @@
           <w:color w:val="6B778C"/>
           <w:sz w:val="19"/>
         </w:rPr>
-        <w:t>Screenshot 3: Online Feature Retrieval via Python Client</w:t>
+        <w:t>Figure 7: Python Client Feature Retrieval Output</w:t>
       </w:r>
     </w:p>
     <w:p>
@@ -3020,7 +3133,7 @@
           <w:color w:val="172B4D"/>
           <w:sz w:val="24"/>
         </w:rPr>
-        <w:t>5.5 Inspect Feature Store Catalog</w:t>
+        <w:t>5.2 Test with cURL REST API</w:t>
       </w:r>
     </w:p>
     <w:p>
@@ -3033,7 +3146,290 @@
           <w:color w:val="172B4D"/>
           <w:sz w:val="21"/>
         </w:rPr>
-        <w:t>Open your web browser and navigate to http://localhost:8888. Verify that the driver entity, driver_hourly_stats feature view, and data sources appear in the catalog.</w:t>
+        <w:t>Query online feature vectors using cURL with request.json payload:</w:t>
+      </w:r>
+    </w:p>
+    <w:tbl>
+      <w:tblPr>
+        <w:tblW w:type="auto" w:w="0"/>
+        <w:jc w:val="center"/>
+        <w:tblLayout w:type="fixed"/>
+        <w:tblLook w:firstColumn="1" w:firstRow="1" w:lastColumn="0" w:lastRow="0" w:noHBand="0" w:noVBand="1" w:val="04A0"/>
+      </w:tblPr>
+      <w:tblGrid>
+        <w:gridCol w:w="9936"/>
+      </w:tblGrid>
+      <w:tr>
+        <w:tc>
+          <w:tcPr>
+            <w:tcW w:type="dxa" w:w="9360"/>
+            <w:shd w:fill="F4F5F7"/>
+            <w:tcMar>
+              <w:top w:w="120" w:type="dxa"/>
+              <w:bottom w:w="120" w:type="dxa"/>
+              <w:left w:w="180" w:type="dxa"/>
+              <w:right w:w="180" w:type="dxa"/>
+            </w:tcMar>
+            <w:tcBorders>
+              <w:top w:val="single" w:sz="4" w:space="0" w:color="E2E4E8"/>
+              <w:left w:val="single" w:sz="18" w:space="0" w:color="0052CC"/>
+              <w:bottom w:val="single" w:sz="4" w:space="0" w:color="E2E4E8"/>
+              <w:right w:val="single" w:sz="4" w:space="0" w:color="E2E4E8"/>
+            </w:tcBorders>
+          </w:tcPr>
+          <w:p>
+            <w:pPr>
+              <w:spacing w:before="40" w:after="40" w:line="276" w:lineRule="auto"/>
+            </w:pPr>
+            <w:r>
+              <w:rPr>
+                <w:rFonts w:ascii="Consolas" w:hAnsi="Consolas"/>
+                <w:color w:val="172B4D"/>
+                <w:sz w:val="19"/>
+              </w:rPr>
+              <w:t>curl.exe -s -X POST http://localhost:6566/get-online-features -H "Content-Type: application/json" -d @request.json</w:t>
+            </w:r>
+          </w:p>
+        </w:tc>
+      </w:tr>
+    </w:tbl>
+    <w:p>
+      <w:pPr>
+        <w:spacing w:before="160" w:after="40"/>
+        <w:jc w:val="center"/>
+      </w:pPr>
+      <w:r>
+        <w:drawing>
+          <wp:inline xmlns:a="http://schemas.openxmlformats.org/drawingml/2006/main" xmlns:pic="http://schemas.openxmlformats.org/drawingml/2006/picture">
+            <wp:extent cx="5669280" cy="1673160"/>
+            <wp:docPr id="8" name="Picture 8"/>
+            <wp:cNvGraphicFramePr>
+              <a:graphicFrameLocks noChangeAspect="1"/>
+            </wp:cNvGraphicFramePr>
+            <a:graphic>
+              <a:graphicData uri="http://schemas.openxmlformats.org/drawingml/2006/picture">
+                <pic:pic>
+                  <pic:nvPicPr>
+                    <pic:cNvPr id="0" name="ss6_curl_rest_api.png"/>
+                    <pic:cNvPicPr/>
+                  </pic:nvPicPr>
+                  <pic:blipFill>
+                    <a:blip r:embed="rId16"/>
+                    <a:stretch>
+                      <a:fillRect/>
+                    </a:stretch>
+                  </pic:blipFill>
+                  <pic:spPr>
+                    <a:xfrm>
+                      <a:off x="0" y="0"/>
+                      <a:ext cx="5669280" cy="1673160"/>
+                    </a:xfrm>
+                    <a:prstGeom prst="rect"/>
+                  </pic:spPr>
+                </pic:pic>
+              </a:graphicData>
+            </a:graphic>
+          </wp:inline>
+        </w:drawing>
+      </w:r>
+    </w:p>
+    <w:p>
+      <w:pPr>
+        <w:spacing w:before="40" w:after="160"/>
+        <w:jc w:val="center"/>
+      </w:pPr>
+      <w:r>
+        <w:rPr>
+          <w:rFonts w:ascii="Calibri" w:hAnsi="Calibri"/>
+          <w:i/>
+          <w:color w:val="6B778C"/>
+          <w:sz w:val="19"/>
+        </w:rPr>
+        <w:t>Figure 8: REST API Query via cURL Output</w:t>
+      </w:r>
+    </w:p>
+    <w:p>
+      <w:pPr>
+        <w:spacing w:before="200" w:after="40"/>
+      </w:pPr>
+      <w:r>
+        <w:rPr>
+          <w:rFonts w:ascii="Calibri" w:hAnsi="Calibri"/>
+          <w:b/>
+          <w:color w:val="172B4D"/>
+          <w:sz w:val="24"/>
+        </w:rPr>
+        <w:t>5.3 Direct SQLite Table Query</w:t>
+      </w:r>
+    </w:p>
+    <w:p>
+      <w:pPr>
+        <w:spacing w:before="40" w:after="80" w:line="276" w:lineRule="auto"/>
+      </w:pPr>
+      <w:r>
+        <w:rPr>
+          <w:rFonts w:ascii="Calibri" w:hAnsi="Calibri"/>
+          <w:color w:val="172B4D"/>
+          <w:sz w:val="21"/>
+        </w:rPr>
+        <w:t>To verify how Feast internally organizes feature tables inside SQLite, open the database using sqlite3:</w:t>
+      </w:r>
+    </w:p>
+    <w:tbl>
+      <w:tblPr>
+        <w:tblW w:type="auto" w:w="0"/>
+        <w:jc w:val="center"/>
+        <w:tblLayout w:type="fixed"/>
+        <w:tblLook w:firstColumn="1" w:firstRow="1" w:lastColumn="0" w:lastRow="0" w:noHBand="0" w:noVBand="1" w:val="04A0"/>
+      </w:tblPr>
+      <w:tblGrid>
+        <w:gridCol w:w="9936"/>
+      </w:tblGrid>
+      <w:tr>
+        <w:tc>
+          <w:tcPr>
+            <w:tcW w:type="dxa" w:w="9360"/>
+            <w:shd w:fill="F4F5F7"/>
+            <w:tcMar>
+              <w:top w:w="120" w:type="dxa"/>
+              <w:bottom w:w="120" w:type="dxa"/>
+              <w:left w:w="180" w:type="dxa"/>
+              <w:right w:w="180" w:type="dxa"/>
+            </w:tcMar>
+            <w:tcBorders>
+              <w:top w:val="single" w:sz="4" w:space="0" w:color="E2E4E8"/>
+              <w:left w:val="single" w:sz="18" w:space="0" w:color="0052CC"/>
+              <w:bottom w:val="single" w:sz="4" w:space="0" w:color="E2E4E8"/>
+              <w:right w:val="single" w:sz="4" w:space="0" w:color="E2E4E8"/>
+            </w:tcBorders>
+          </w:tcPr>
+          <w:p>
+            <w:pPr>
+              <w:spacing w:before="40" w:after="40" w:line="276" w:lineRule="auto"/>
+            </w:pPr>
+            <w:r>
+              <w:rPr>
+                <w:rFonts w:ascii="Consolas" w:hAnsi="Consolas"/>
+                <w:color w:val="172B4D"/>
+                <w:sz w:val="19"/>
+              </w:rPr>
+              <w:t>sqlite3 feature_repo/data/online_store.db</w:t>
+              <w:br/>
+              <w:t>sqlite&gt; .tables</w:t>
+              <w:br/>
+              <w:t>sqlite&gt; SELECT entity_key, feature_name, value FROM driver_ranking_driver_hourly_stats LIMIT 3;</w:t>
+            </w:r>
+          </w:p>
+        </w:tc>
+      </w:tr>
+    </w:tbl>
+    <w:p>
+      <w:pPr>
+        <w:spacing w:before="160" w:after="40"/>
+        <w:jc w:val="center"/>
+      </w:pPr>
+      <w:r>
+        <w:drawing>
+          <wp:inline xmlns:a="http://schemas.openxmlformats.org/drawingml/2006/main" xmlns:pic="http://schemas.openxmlformats.org/drawingml/2006/picture">
+            <wp:extent cx="5669280" cy="1085607"/>
+            <wp:docPr id="9" name="Picture 9"/>
+            <wp:cNvGraphicFramePr>
+              <a:graphicFrameLocks noChangeAspect="1"/>
+            </wp:cNvGraphicFramePr>
+            <a:graphic>
+              <a:graphicData uri="http://schemas.openxmlformats.org/drawingml/2006/picture">
+                <pic:pic>
+                  <pic:nvPicPr>
+                    <pic:cNvPr id="0" name="ss10_sqlite_table_query.png"/>
+                    <pic:cNvPicPr/>
+                  </pic:nvPicPr>
+                  <pic:blipFill>
+                    <a:blip r:embed="rId17"/>
+                    <a:stretch>
+                      <a:fillRect/>
+                    </a:stretch>
+                  </pic:blipFill>
+                  <pic:spPr>
+                    <a:xfrm>
+                      <a:off x="0" y="0"/>
+                      <a:ext cx="5669280" cy="1085607"/>
+                    </a:xfrm>
+                    <a:prstGeom prst="rect"/>
+                  </pic:spPr>
+                </pic:pic>
+              </a:graphicData>
+            </a:graphic>
+          </wp:inline>
+        </w:drawing>
+      </w:r>
+    </w:p>
+    <w:p>
+      <w:pPr>
+        <w:spacing w:before="40" w:after="160"/>
+        <w:jc w:val="center"/>
+      </w:pPr>
+      <w:r>
+        <w:rPr>
+          <w:rFonts w:ascii="Calibri" w:hAnsi="Calibri"/>
+          <w:i/>
+          <w:color w:val="6B778C"/>
+          <w:sz w:val="19"/>
+        </w:rPr>
+        <w:t>Figure 9: SQLite3 Command Line Table Query</w:t>
+      </w:r>
+    </w:p>
+    <w:p>
+      <w:pPr>
+        <w:spacing w:before="280" w:after="80"/>
+      </w:pPr>
+      <w:r>
+        <w:rPr>
+          <w:rFonts w:ascii="Calibri" w:hAnsi="Calibri"/>
+          <w:b/>
+          <w:color w:val="0052CC"/>
+          <w:sz w:val="30"/>
+        </w:rPr>
+        <w:t>Chapter 6: Feast Web UI and Metadata Catalog Exploration</w:t>
+      </w:r>
+    </w:p>
+    <w:p>
+      <w:pPr>
+        <w:spacing w:before="40" w:after="80" w:line="276" w:lineRule="auto"/>
+      </w:pPr>
+      <w:r>
+        <w:rPr>
+          <w:rFonts w:ascii="Calibri" w:hAnsi="Calibri"/>
+          <w:color w:val="172B4D"/>
+          <w:sz w:val="21"/>
+        </w:rPr>
+        <w:t>The Feast Web UI provides a centralized catalog for data scientists and ML engineers to browse entities, feature views, schemas, and source definitions.</w:t>
+      </w:r>
+    </w:p>
+    <w:p>
+      <w:pPr>
+        <w:spacing w:before="200" w:after="40"/>
+      </w:pPr>
+      <w:r>
+        <w:rPr>
+          <w:rFonts w:ascii="Calibri" w:hAnsi="Calibri"/>
+          <w:b/>
+          <w:color w:val="172B4D"/>
+          <w:sz w:val="24"/>
+        </w:rPr>
+        <w:t>6.1 Inspect Feature Store Catalog</w:t>
+      </w:r>
+    </w:p>
+    <w:p>
+      <w:pPr>
+        <w:spacing w:before="40" w:after="80" w:line="276" w:lineRule="auto"/>
+      </w:pPr>
+      <w:r>
+        <w:rPr>
+          <w:rFonts w:ascii="Calibri" w:hAnsi="Calibri"/>
+          <w:color w:val="172B4D"/>
+          <w:sz w:val="21"/>
+        </w:rPr>
+        <w:t>Open your web browser and navigate to http://localhost:8888. Verify that the driver_ranking project, driver entity, and driver_hourly_stats feature view appear in the catalog.</w:t>
       </w:r>
     </w:p>
     <w:p>
@@ -3045,7 +3441,7 @@
         <w:drawing>
           <wp:inline xmlns:a="http://schemas.openxmlformats.org/drawingml/2006/main" xmlns:pic="http://schemas.openxmlformats.org/drawingml/2006/picture">
             <wp:extent cx="5669280" cy="3644537"/>
-            <wp:docPr id="5" name="Picture 5"/>
+            <wp:docPr id="10" name="Picture 10"/>
             <wp:cNvGraphicFramePr>
               <a:graphicFrameLocks noChangeAspect="1"/>
             </wp:cNvGraphicFramePr>
@@ -3053,11 +3449,11 @@
               <a:graphicData uri="http://schemas.openxmlformats.org/drawingml/2006/picture">
                 <pic:pic>
                   <pic:nvPicPr>
-                    <pic:cNvPr id="0" name="ss4_feast_web_ui.png"/>
+                    <pic:cNvPr id="0" name="ss7_feast_web_ui.png"/>
                     <pic:cNvPicPr/>
                   </pic:nvPicPr>
                   <pic:blipFill>
-                    <a:blip r:embed="rId13"/>
+                    <a:blip r:embed="rId18"/>
                     <a:stretch>
                       <a:fillRect/>
                     </a:stretch>
@@ -3088,7 +3484,7 @@
           <w:color w:val="6B778C"/>
           <w:sz w:val="19"/>
         </w:rPr>
-        <w:t>Screenshot 4: Feast Web UI Catalog Dashboard at http://localhost:8888</w:t>
+        <w:t>Figure 10: Feast Web UI Catalog Dashboard at http://localhost:8888</w:t>
       </w:r>
     </w:p>
     <w:p>
@@ -3102,13 +3498,27 @@
           <w:color w:val="172B4D"/>
           <w:sz w:val="24"/>
         </w:rPr>
-        <w:t>5.6 Experiment: Handling Unseen Entities</w:t>
+        <w:t>6.2 Inspect Registered Entities via CLI</w:t>
+      </w:r>
+    </w:p>
+    <w:p>
+      <w:pPr>
+        <w:spacing w:before="40" w:after="80" w:line="276" w:lineRule="auto"/>
+      </w:pPr>
+      <w:r>
+        <w:rPr>
+          <w:rFonts w:ascii="Calibri" w:hAnsi="Calibri"/>
+          <w:color w:val="172B4D"/>
+          <w:sz w:val="21"/>
+        </w:rPr>
+        <w:t>Inspect registered Feast entities from the command line:</w:t>
       </w:r>
     </w:p>
     <w:tbl>
       <w:tblPr>
         <w:tblW w:type="auto" w:w="0"/>
         <w:jc w:val="center"/>
+        <w:tblLayout w:type="fixed"/>
         <w:tblLook w:firstColumn="1" w:firstRow="1" w:lastColumn="0" w:lastRow="0" w:noHBand="0" w:noVBand="1" w:val="04A0"/>
       </w:tblPr>
       <w:tblGrid>
@@ -3118,49 +3528,810 @@
         <w:tc>
           <w:tcPr>
             <w:tcW w:type="dxa" w:w="9360"/>
-            <w:shd w:fill="EBF3FC"/>
+            <w:shd w:fill="F4F5F7"/>
             <w:tcMar>
-              <w:top w:w="140" w:type="dxa"/>
-              <w:bottom w:w="140" w:type="dxa"/>
+              <w:top w:w="120" w:type="dxa"/>
+              <w:bottom w:w="120" w:type="dxa"/>
               <w:left w:w="180" w:type="dxa"/>
               <w:right w:w="180" w:type="dxa"/>
             </w:tcMar>
             <w:tcBorders>
-              <w:top w:val="single" w:sz="4" w:space="0" w:color="CCE0F5"/>
-              <w:left w:val="single" w:sz="24" w:space="0" w:color="0052CC"/>
-              <w:bottom w:val="single" w:sz="4" w:space="0" w:color="CCE0F5"/>
-              <w:right w:val="single" w:sz="4" w:space="0" w:color="CCE0F5"/>
+              <w:top w:val="single" w:sz="4" w:space="0" w:color="E2E4E8"/>
+              <w:left w:val="single" w:sz="18" w:space="0" w:color="0052CC"/>
+              <w:bottom w:val="single" w:sz="4" w:space="0" w:color="E2E4E8"/>
+              <w:right w:val="single" w:sz="4" w:space="0" w:color="E2E4E8"/>
             </w:tcBorders>
           </w:tcPr>
           <w:p>
             <w:pPr>
-              <w:spacing w:before="40" w:after="80"/>
+              <w:spacing w:before="40" w:after="40" w:line="276" w:lineRule="auto"/>
+            </w:pPr>
+            <w:r>
+              <w:rPr>
+                <w:rFonts w:ascii="Consolas" w:hAnsi="Consolas"/>
+                <w:color w:val="172B4D"/>
+                <w:sz w:val="19"/>
+              </w:rPr>
+              <w:t>docker exec feast-server feast entities list</w:t>
+            </w:r>
+          </w:p>
+        </w:tc>
+      </w:tr>
+    </w:tbl>
+    <w:p>
+      <w:pPr>
+        <w:spacing w:before="160" w:after="40"/>
+        <w:jc w:val="center"/>
+      </w:pPr>
+      <w:r>
+        <w:drawing>
+          <wp:inline xmlns:a="http://schemas.openxmlformats.org/drawingml/2006/main" xmlns:pic="http://schemas.openxmlformats.org/drawingml/2006/picture">
+            <wp:extent cx="5669280" cy="646098"/>
+            <wp:docPr id="11" name="Picture 11"/>
+            <wp:cNvGraphicFramePr>
+              <a:graphicFrameLocks noChangeAspect="1"/>
+            </wp:cNvGraphicFramePr>
+            <a:graphic>
+              <a:graphicData uri="http://schemas.openxmlformats.org/drawingml/2006/picture">
+                <pic:pic>
+                  <pic:nvPicPr>
+                    <pic:cNvPr id="0" name="ss8_feast_entities_list.png"/>
+                    <pic:cNvPicPr/>
+                  </pic:nvPicPr>
+                  <pic:blipFill>
+                    <a:blip r:embed="rId19"/>
+                    <a:stretch>
+                      <a:fillRect/>
+                    </a:stretch>
+                  </pic:blipFill>
+                  <pic:spPr>
+                    <a:xfrm>
+                      <a:off x="0" y="0"/>
+                      <a:ext cx="5669280" cy="646098"/>
+                    </a:xfrm>
+                    <a:prstGeom prst="rect"/>
+                  </pic:spPr>
+                </pic:pic>
+              </a:graphicData>
+            </a:graphic>
+          </wp:inline>
+        </w:drawing>
+      </w:r>
+    </w:p>
+    <w:p>
+      <w:pPr>
+        <w:spacing w:before="40" w:after="160"/>
+        <w:jc w:val="center"/>
+      </w:pPr>
+      <w:r>
+        <w:rPr>
+          <w:rFonts w:ascii="Calibri" w:hAnsi="Calibri"/>
+          <w:i/>
+          <w:color w:val="6B778C"/>
+          <w:sz w:val="19"/>
+        </w:rPr>
+        <w:t>Figure 11: Feast CLI Registered Entities List</w:t>
+      </w:r>
+    </w:p>
+    <w:p>
+      <w:pPr>
+        <w:spacing w:before="200" w:after="40"/>
+      </w:pPr>
+      <w:r>
+        <w:rPr>
+          <w:rFonts w:ascii="Calibri" w:hAnsi="Calibri"/>
+          <w:b/>
+          <w:color w:val="172B4D"/>
+          <w:sz w:val="24"/>
+        </w:rPr>
+        <w:t>6.3 Inspect Registered Feature Views via CLI</w:t>
+      </w:r>
+    </w:p>
+    <w:p>
+      <w:pPr>
+        <w:spacing w:before="40" w:after="80" w:line="276" w:lineRule="auto"/>
+      </w:pPr>
+      <w:r>
+        <w:rPr>
+          <w:rFonts w:ascii="Calibri" w:hAnsi="Calibri"/>
+          <w:color w:val="172B4D"/>
+          <w:sz w:val="21"/>
+        </w:rPr>
+        <w:t>List registered feature views and verify the online store backend:</w:t>
+      </w:r>
+    </w:p>
+    <w:tbl>
+      <w:tblPr>
+        <w:tblW w:type="auto" w:w="0"/>
+        <w:jc w:val="center"/>
+        <w:tblLayout w:type="fixed"/>
+        <w:tblLook w:firstColumn="1" w:firstRow="1" w:lastColumn="0" w:lastRow="0" w:noHBand="0" w:noVBand="1" w:val="04A0"/>
+      </w:tblPr>
+      <w:tblGrid>
+        <w:gridCol w:w="9936"/>
+      </w:tblGrid>
+      <w:tr>
+        <w:tc>
+          <w:tcPr>
+            <w:tcW w:type="dxa" w:w="9360"/>
+            <w:shd w:fill="F4F5F7"/>
+            <w:tcMar>
+              <w:top w:w="120" w:type="dxa"/>
+              <w:bottom w:w="120" w:type="dxa"/>
+              <w:left w:w="180" w:type="dxa"/>
+              <w:right w:w="180" w:type="dxa"/>
+            </w:tcMar>
+            <w:tcBorders>
+              <w:top w:val="single" w:sz="4" w:space="0" w:color="E2E4E8"/>
+              <w:left w:val="single" w:sz="18" w:space="0" w:color="0052CC"/>
+              <w:bottom w:val="single" w:sz="4" w:space="0" w:color="E2E4E8"/>
+              <w:right w:val="single" w:sz="4" w:space="0" w:color="E2E4E8"/>
+            </w:tcBorders>
+          </w:tcPr>
+          <w:p>
+            <w:pPr>
+              <w:spacing w:before="40" w:after="40" w:line="276" w:lineRule="auto"/>
+            </w:pPr>
+            <w:r>
+              <w:rPr>
+                <w:rFonts w:ascii="Consolas" w:hAnsi="Consolas"/>
+                <w:color w:val="172B4D"/>
+                <w:sz w:val="19"/>
+              </w:rPr>
+              <w:t>docker exec feast-server feast feature-views list</w:t>
+            </w:r>
+          </w:p>
+        </w:tc>
+      </w:tr>
+    </w:tbl>
+    <w:p>
+      <w:pPr>
+        <w:spacing w:before="160" w:after="40"/>
+        <w:jc w:val="center"/>
+      </w:pPr>
+      <w:r>
+        <w:drawing>
+          <wp:inline xmlns:a="http://schemas.openxmlformats.org/drawingml/2006/main" xmlns:pic="http://schemas.openxmlformats.org/drawingml/2006/picture">
+            <wp:extent cx="5669280" cy="626001"/>
+            <wp:docPr id="12" name="Picture 12"/>
+            <wp:cNvGraphicFramePr>
+              <a:graphicFrameLocks noChangeAspect="1"/>
+            </wp:cNvGraphicFramePr>
+            <a:graphic>
+              <a:graphicData uri="http://schemas.openxmlformats.org/drawingml/2006/picture">
+                <pic:pic>
+                  <pic:nvPicPr>
+                    <pic:cNvPr id="0" name="ss9_feast_feature_views_list.png"/>
+                    <pic:cNvPicPr/>
+                  </pic:nvPicPr>
+                  <pic:blipFill>
+                    <a:blip r:embed="rId20"/>
+                    <a:stretch>
+                      <a:fillRect/>
+                    </a:stretch>
+                  </pic:blipFill>
+                  <pic:spPr>
+                    <a:xfrm>
+                      <a:off x="0" y="0"/>
+                      <a:ext cx="5669280" cy="626001"/>
+                    </a:xfrm>
+                    <a:prstGeom prst="rect"/>
+                  </pic:spPr>
+                </pic:pic>
+              </a:graphicData>
+            </a:graphic>
+          </wp:inline>
+        </w:drawing>
+      </w:r>
+    </w:p>
+    <w:p>
+      <w:pPr>
+        <w:spacing w:before="40" w:after="160"/>
+        <w:jc w:val="center"/>
+      </w:pPr>
+      <w:r>
+        <w:rPr>
+          <w:rFonts w:ascii="Calibri" w:hAnsi="Calibri"/>
+          <w:i/>
+          <w:color w:val="6B778C"/>
+          <w:sz w:val="19"/>
+        </w:rPr>
+        <w:t>Figure 12: Feast CLI Registered Feature Views List</w:t>
+      </w:r>
+    </w:p>
+    <w:p>
+      <w:pPr>
+        <w:spacing w:before="280" w:after="80"/>
+      </w:pPr>
+      <w:r>
+        <w:rPr>
+          <w:rFonts w:ascii="Calibri" w:hAnsi="Calibri"/>
+          <w:b/>
+          <w:color w:val="0052CC"/>
+          <w:sz w:val="30"/>
+        </w:rPr>
+        <w:t>Chapter 7: Architectural Evaluation: SQLite vs Redis</w:t>
+      </w:r>
+    </w:p>
+    <w:p>
+      <w:pPr>
+        <w:spacing w:before="40" w:after="80" w:line="276" w:lineRule="auto"/>
+      </w:pPr>
+      <w:r>
+        <w:rPr>
+          <w:rFonts w:ascii="Calibri" w:hAnsi="Calibri"/>
+          <w:color w:val="172B4D"/>
+          <w:sz w:val="21"/>
+        </w:rPr>
+        <w:t>Choosing an online store backend depends on system latency requirements, deployment topology, and operational overhead:</w:t>
+      </w:r>
+    </w:p>
+    <w:tbl>
+      <w:tblPr>
+        <w:tblW w:type="auto" w:w="0"/>
+        <w:jc w:val="center"/>
+        <w:tblLayout w:type="fixed"/>
+        <w:tblLook w:firstColumn="1" w:firstRow="1" w:lastColumn="0" w:lastRow="0" w:noHBand="0" w:noVBand="1" w:val="04A0"/>
+      </w:tblPr>
+      <w:tblGrid>
+        <w:gridCol w:w="3312"/>
+        <w:gridCol w:w="3312"/>
+        <w:gridCol w:w="3312"/>
+      </w:tblGrid>
+      <w:tr>
+        <w:tc>
+          <w:tcPr>
+            <w:tcW w:type="dxa" w:w="2592"/>
+            <w:shd w:fill="0052CC"/>
+            <w:tcMar>
+              <w:top w:w="120" w:type="dxa"/>
+              <w:bottom w:w="120" w:type="dxa"/>
+              <w:left w:w="120" w:type="dxa"/>
+              <w:right w:w="120" w:type="dxa"/>
+            </w:tcMar>
+          </w:tcPr>
+          <w:p>
+            <w:pPr>
+              <w:jc w:val="left"/>
             </w:pPr>
             <w:r>
               <w:rPr>
                 <w:rFonts w:ascii="Calibri" w:hAnsi="Calibri"/>
                 <w:b/>
-                <w:color w:val="0052CC"/>
-                <w:sz w:val="21"/>
+                <w:color w:val="FFFFFF"/>
+                <w:sz w:val="20"/>
               </w:rPr>
-              <w:t>Experiment: Missing Entities</w:t>
-              <w:br/>
+              <w:t>Dimension</w:t>
             </w:r>
+          </w:p>
+        </w:tc>
+        <w:tc>
+          <w:tcPr>
+            <w:tcW w:type="dxa" w:w="3312"/>
+            <w:shd w:fill="0052CC"/>
+            <w:tcMar>
+              <w:top w:w="120" w:type="dxa"/>
+              <w:bottom w:w="120" w:type="dxa"/>
+              <w:left w:w="120" w:type="dxa"/>
+              <w:right w:w="120" w:type="dxa"/>
+            </w:tcMar>
+          </w:tcPr>
+          <w:p>
+            <w:pPr>
+              <w:jc w:val="left"/>
+            </w:pPr>
+            <w:r>
+              <w:rPr>
+                <w:rFonts w:ascii="Calibri" w:hAnsi="Calibri"/>
+                <w:b/>
+                <w:color w:val="FFFFFF"/>
+                <w:sz w:val="20"/>
+              </w:rPr>
+              <w:t>SQLite Online Store</w:t>
+            </w:r>
+          </w:p>
+        </w:tc>
+        <w:tc>
+          <w:tcPr>
+            <w:tcW w:type="dxa" w:w="3456"/>
+            <w:shd w:fill="0052CC"/>
+            <w:tcMar>
+              <w:top w:w="120" w:type="dxa"/>
+              <w:bottom w:w="120" w:type="dxa"/>
+              <w:left w:w="120" w:type="dxa"/>
+              <w:right w:w="120" w:type="dxa"/>
+            </w:tcMar>
+          </w:tcPr>
+          <w:p>
+            <w:pPr>
+              <w:jc w:val="left"/>
+            </w:pPr>
+            <w:r>
+              <w:rPr>
+                <w:rFonts w:ascii="Calibri" w:hAnsi="Calibri"/>
+                <w:b/>
+                <w:color w:val="FFFFFF"/>
+                <w:sz w:val="20"/>
+              </w:rPr>
+              <w:t>Redis Online Store</w:t>
+            </w:r>
+          </w:p>
+        </w:tc>
+      </w:tr>
+      <w:tr>
+        <w:tc>
+          <w:tcPr>
+            <w:tcW w:type="dxa" w:w="2592"/>
+            <w:shd w:fill="FFFFFF"/>
+            <w:tcMar>
+              <w:top w:w="80" w:type="dxa"/>
+              <w:bottom w:w="80" w:type="dxa"/>
+              <w:left w:w="120" w:type="dxa"/>
+              <w:right w:w="120" w:type="dxa"/>
+            </w:tcMar>
+          </w:tcPr>
+          <w:p>
             <w:r>
               <w:rPr>
                 <w:rFonts w:ascii="Calibri" w:hAnsi="Calibri"/>
                 <w:color w:val="172B4D"/>
-                <w:sz w:val="20"/>
+                <w:sz w:val="19"/>
               </w:rPr>
-              <w:t>Observation: Query Feast for an entity ID that does not exist in the offline dataset (e.g. driver_id: 9999). Feast returns status NOT_FOUND with null values.</w:t>
-              <w:br/>
-              <w:br/>
-              <w:t>Resolution: Production inference pipelines must implement defensive handling for missing values, such as imputing global feature averages or executing fallback business logic.</w:t>
+              <w:t>Architecture</w:t>
+            </w:r>
+          </w:p>
+        </w:tc>
+        <w:tc>
+          <w:tcPr>
+            <w:tcW w:type="dxa" w:w="3312"/>
+            <w:shd w:fill="FFFFFF"/>
+            <w:tcMar>
+              <w:top w:w="80" w:type="dxa"/>
+              <w:bottom w:w="80" w:type="dxa"/>
+              <w:left w:w="120" w:type="dxa"/>
+              <w:right w:w="120" w:type="dxa"/>
+            </w:tcMar>
+          </w:tcPr>
+          <w:p>
+            <w:r>
+              <w:rPr>
+                <w:rFonts w:ascii="Calibri" w:hAnsi="Calibri"/>
+                <w:color w:val="172B4D"/>
+                <w:sz w:val="19"/>
+              </w:rPr>
+              <w:t>Serverless embedded file database</w:t>
+            </w:r>
+          </w:p>
+        </w:tc>
+        <w:tc>
+          <w:tcPr>
+            <w:tcW w:type="dxa" w:w="3456"/>
+            <w:shd w:fill="FFFFFF"/>
+            <w:tcMar>
+              <w:top w:w="80" w:type="dxa"/>
+              <w:bottom w:w="80" w:type="dxa"/>
+              <w:left w:w="120" w:type="dxa"/>
+              <w:right w:w="120" w:type="dxa"/>
+            </w:tcMar>
+          </w:tcPr>
+          <w:p>
+            <w:r>
+              <w:rPr>
+                <w:rFonts w:ascii="Calibri" w:hAnsi="Calibri"/>
+                <w:color w:val="172B4D"/>
+                <w:sz w:val="19"/>
+              </w:rPr>
+              <w:t>Dedicated in-memory caching daemon</w:t>
+            </w:r>
+          </w:p>
+        </w:tc>
+      </w:tr>
+      <w:tr>
+        <w:tc>
+          <w:tcPr>
+            <w:tcW w:type="dxa" w:w="2592"/>
+            <w:shd w:fill="F8F9FA"/>
+            <w:tcMar>
+              <w:top w:w="80" w:type="dxa"/>
+              <w:bottom w:w="80" w:type="dxa"/>
+              <w:left w:w="120" w:type="dxa"/>
+              <w:right w:w="120" w:type="dxa"/>
+            </w:tcMar>
+          </w:tcPr>
+          <w:p>
+            <w:r>
+              <w:rPr>
+                <w:rFonts w:ascii="Calibri" w:hAnsi="Calibri"/>
+                <w:color w:val="172B4D"/>
+                <w:sz w:val="19"/>
+              </w:rPr>
+              <w:t>Deployment Complexity</w:t>
+            </w:r>
+          </w:p>
+        </w:tc>
+        <w:tc>
+          <w:tcPr>
+            <w:tcW w:type="dxa" w:w="3312"/>
+            <w:shd w:fill="F8F9FA"/>
+            <w:tcMar>
+              <w:top w:w="80" w:type="dxa"/>
+              <w:bottom w:w="80" w:type="dxa"/>
+              <w:left w:w="120" w:type="dxa"/>
+              <w:right w:w="120" w:type="dxa"/>
+            </w:tcMar>
+          </w:tcPr>
+          <w:p>
+            <w:r>
+              <w:rPr>
+                <w:rFonts w:ascii="Calibri" w:hAnsi="Calibri"/>
+                <w:color w:val="172B4D"/>
+                <w:sz w:val="19"/>
+              </w:rPr>
+              <w:t>Zero infrastructure overhead (single .db file)</w:t>
+            </w:r>
+          </w:p>
+        </w:tc>
+        <w:tc>
+          <w:tcPr>
+            <w:tcW w:type="dxa" w:w="3456"/>
+            <w:shd w:fill="F8F9FA"/>
+            <w:tcMar>
+              <w:top w:w="80" w:type="dxa"/>
+              <w:bottom w:w="80" w:type="dxa"/>
+              <w:left w:w="120" w:type="dxa"/>
+              <w:right w:w="120" w:type="dxa"/>
+            </w:tcMar>
+          </w:tcPr>
+          <w:p>
+            <w:r>
+              <w:rPr>
+                <w:rFonts w:ascii="Calibri" w:hAnsi="Calibri"/>
+                <w:color w:val="172B4D"/>
+                <w:sz w:val="19"/>
+              </w:rPr>
+              <w:t>Requires separate container, network, and healthcheck</w:t>
+            </w:r>
+          </w:p>
+        </w:tc>
+      </w:tr>
+      <w:tr>
+        <w:tc>
+          <w:tcPr>
+            <w:tcW w:type="dxa" w:w="2592"/>
+            <w:shd w:fill="FFFFFF"/>
+            <w:tcMar>
+              <w:top w:w="80" w:type="dxa"/>
+              <w:bottom w:w="80" w:type="dxa"/>
+              <w:left w:w="120" w:type="dxa"/>
+              <w:right w:w="120" w:type="dxa"/>
+            </w:tcMar>
+          </w:tcPr>
+          <w:p>
+            <w:r>
+              <w:rPr>
+                <w:rFonts w:ascii="Calibri" w:hAnsi="Calibri"/>
+                <w:color w:val="172B4D"/>
+                <w:sz w:val="19"/>
+              </w:rPr>
+              <w:t>Persistence Model</w:t>
+            </w:r>
+          </w:p>
+        </w:tc>
+        <w:tc>
+          <w:tcPr>
+            <w:tcW w:type="dxa" w:w="3312"/>
+            <w:shd w:fill="FFFFFF"/>
+            <w:tcMar>
+              <w:top w:w="80" w:type="dxa"/>
+              <w:bottom w:w="80" w:type="dxa"/>
+              <w:left w:w="120" w:type="dxa"/>
+              <w:right w:w="120" w:type="dxa"/>
+            </w:tcMar>
+          </w:tcPr>
+          <w:p>
+            <w:r>
+              <w:rPr>
+                <w:rFonts w:ascii="Calibri" w:hAnsi="Calibri"/>
+                <w:color w:val="172B4D"/>
+                <w:sz w:val="19"/>
+              </w:rPr>
+              <w:t>Immediate disk write via Docker bind mount</w:t>
+            </w:r>
+          </w:p>
+        </w:tc>
+        <w:tc>
+          <w:tcPr>
+            <w:tcW w:type="dxa" w:w="3456"/>
+            <w:shd w:fill="FFFFFF"/>
+            <w:tcMar>
+              <w:top w:w="80" w:type="dxa"/>
+              <w:bottom w:w="80" w:type="dxa"/>
+              <w:left w:w="120" w:type="dxa"/>
+              <w:right w:w="120" w:type="dxa"/>
+            </w:tcMar>
+          </w:tcPr>
+          <w:p>
+            <w:r>
+              <w:rPr>
+                <w:rFonts w:ascii="Calibri" w:hAnsi="Calibri"/>
+                <w:color w:val="172B4D"/>
+                <w:sz w:val="19"/>
+              </w:rPr>
+              <w:t>In-memory with optional append-only file (AOF/RDB)</w:t>
+            </w:r>
+          </w:p>
+        </w:tc>
+      </w:tr>
+      <w:tr>
+        <w:tc>
+          <w:tcPr>
+            <w:tcW w:type="dxa" w:w="2592"/>
+            <w:shd w:fill="F8F9FA"/>
+            <w:tcMar>
+              <w:top w:w="80" w:type="dxa"/>
+              <w:bottom w:w="80" w:type="dxa"/>
+              <w:left w:w="120" w:type="dxa"/>
+              <w:right w:w="120" w:type="dxa"/>
+            </w:tcMar>
+          </w:tcPr>
+          <w:p>
+            <w:r>
+              <w:rPr>
+                <w:rFonts w:ascii="Calibri" w:hAnsi="Calibri"/>
+                <w:color w:val="172B4D"/>
+                <w:sz w:val="19"/>
+              </w:rPr>
+              <w:t>Read Latency</w:t>
+            </w:r>
+          </w:p>
+        </w:tc>
+        <w:tc>
+          <w:tcPr>
+            <w:tcW w:type="dxa" w:w="3312"/>
+            <w:shd w:fill="F8F9FA"/>
+            <w:tcMar>
+              <w:top w:w="80" w:type="dxa"/>
+              <w:bottom w:w="80" w:type="dxa"/>
+              <w:left w:w="120" w:type="dxa"/>
+              <w:right w:w="120" w:type="dxa"/>
+            </w:tcMar>
+          </w:tcPr>
+          <w:p>
+            <w:r>
+              <w:rPr>
+                <w:rFonts w:ascii="Calibri" w:hAnsi="Calibri"/>
+                <w:color w:val="172B4D"/>
+                <w:sz w:val="19"/>
+              </w:rPr>
+              <w:t>Low (approx 2 to 5 milliseconds)</w:t>
+            </w:r>
+          </w:p>
+        </w:tc>
+        <w:tc>
+          <w:tcPr>
+            <w:tcW w:type="dxa" w:w="3456"/>
+            <w:shd w:fill="F8F9FA"/>
+            <w:tcMar>
+              <w:top w:w="80" w:type="dxa"/>
+              <w:bottom w:w="80" w:type="dxa"/>
+              <w:left w:w="120" w:type="dxa"/>
+              <w:right w:w="120" w:type="dxa"/>
+            </w:tcMar>
+          </w:tcPr>
+          <w:p>
+            <w:r>
+              <w:rPr>
+                <w:rFonts w:ascii="Calibri" w:hAnsi="Calibri"/>
+                <w:color w:val="172B4D"/>
+                <w:sz w:val="19"/>
+              </w:rPr>
+              <w:t>Sub-millisecond (approx 0.5 to 1 millisecond)</w:t>
+            </w:r>
+          </w:p>
+        </w:tc>
+      </w:tr>
+      <w:tr>
+        <w:tc>
+          <w:tcPr>
+            <w:tcW w:type="dxa" w:w="2592"/>
+            <w:shd w:fill="FFFFFF"/>
+            <w:tcMar>
+              <w:top w:w="80" w:type="dxa"/>
+              <w:bottom w:w="80" w:type="dxa"/>
+              <w:left w:w="120" w:type="dxa"/>
+              <w:right w:w="120" w:type="dxa"/>
+            </w:tcMar>
+          </w:tcPr>
+          <w:p>
+            <w:r>
+              <w:rPr>
+                <w:rFonts w:ascii="Calibri" w:hAnsi="Calibri"/>
+                <w:color w:val="172B4D"/>
+                <w:sz w:val="19"/>
+              </w:rPr>
+              <w:t>Concurrent Writes</w:t>
+            </w:r>
+          </w:p>
+        </w:tc>
+        <w:tc>
+          <w:tcPr>
+            <w:tcW w:type="dxa" w:w="3312"/>
+            <w:shd w:fill="FFFFFF"/>
+            <w:tcMar>
+              <w:top w:w="80" w:type="dxa"/>
+              <w:bottom w:w="80" w:type="dxa"/>
+              <w:left w:w="120" w:type="dxa"/>
+              <w:right w:w="120" w:type="dxa"/>
+            </w:tcMar>
+          </w:tcPr>
+          <w:p>
+            <w:r>
+              <w:rPr>
+                <w:rFonts w:ascii="Calibri" w:hAnsi="Calibri"/>
+                <w:color w:val="172B4D"/>
+                <w:sz w:val="19"/>
+              </w:rPr>
+              <w:t>Limited by SQLite database file locking</w:t>
+            </w:r>
+          </w:p>
+        </w:tc>
+        <w:tc>
+          <w:tcPr>
+            <w:tcW w:type="dxa" w:w="3456"/>
+            <w:shd w:fill="FFFFFF"/>
+            <w:tcMar>
+              <w:top w:w="80" w:type="dxa"/>
+              <w:bottom w:w="80" w:type="dxa"/>
+              <w:left w:w="120" w:type="dxa"/>
+              <w:right w:w="120" w:type="dxa"/>
+            </w:tcMar>
+          </w:tcPr>
+          <w:p>
+            <w:r>
+              <w:rPr>
+                <w:rFonts w:ascii="Calibri" w:hAnsi="Calibri"/>
+                <w:color w:val="172B4D"/>
+                <w:sz w:val="19"/>
+              </w:rPr>
+              <w:t>Highly concurrent non-blocking single-threaded engine</w:t>
+            </w:r>
+          </w:p>
+        </w:tc>
+      </w:tr>
+      <w:tr>
+        <w:tc>
+          <w:tcPr>
+            <w:tcW w:type="dxa" w:w="2592"/>
+            <w:shd w:fill="F8F9FA"/>
+            <w:tcMar>
+              <w:top w:w="80" w:type="dxa"/>
+              <w:bottom w:w="80" w:type="dxa"/>
+              <w:left w:w="120" w:type="dxa"/>
+              <w:right w:w="120" w:type="dxa"/>
+            </w:tcMar>
+          </w:tcPr>
+          <w:p>
+            <w:r>
+              <w:rPr>
+                <w:rFonts w:ascii="Calibri" w:hAnsi="Calibri"/>
+                <w:color w:val="172B4D"/>
+                <w:sz w:val="19"/>
+              </w:rPr>
+              <w:t>Optimal Use Case</w:t>
+            </w:r>
+          </w:p>
+        </w:tc>
+        <w:tc>
+          <w:tcPr>
+            <w:tcW w:type="dxa" w:w="3312"/>
+            <w:shd w:fill="F8F9FA"/>
+            <w:tcMar>
+              <w:top w:w="80" w:type="dxa"/>
+              <w:bottom w:w="80" w:type="dxa"/>
+              <w:left w:w="120" w:type="dxa"/>
+              <w:right w:w="120" w:type="dxa"/>
+            </w:tcMar>
+          </w:tcPr>
+          <w:p>
+            <w:r>
+              <w:rPr>
+                <w:rFonts w:ascii="Calibri" w:hAnsi="Calibri"/>
+                <w:color w:val="172B4D"/>
+                <w:sz w:val="19"/>
+              </w:rPr>
+              <w:t>Local development, testing, edge devices, single-node</w:t>
+            </w:r>
+          </w:p>
+        </w:tc>
+        <w:tc>
+          <w:tcPr>
+            <w:tcW w:type="dxa" w:w="3456"/>
+            <w:shd w:fill="F8F9FA"/>
+            <w:tcMar>
+              <w:top w:w="80" w:type="dxa"/>
+              <w:bottom w:w="80" w:type="dxa"/>
+              <w:left w:w="120" w:type="dxa"/>
+              <w:right w:w="120" w:type="dxa"/>
+            </w:tcMar>
+          </w:tcPr>
+          <w:p>
+            <w:r>
+              <w:rPr>
+                <w:rFonts w:ascii="Calibri" w:hAnsi="Calibri"/>
+                <w:color w:val="172B4D"/>
+                <w:sz w:val="19"/>
+              </w:rPr>
+              <w:t>High-throughput distributed production clusters</w:t>
             </w:r>
           </w:p>
         </w:tc>
       </w:tr>
     </w:tbl>
+    <w:p>
+      <w:pPr>
+        <w:spacing w:before="280" w:after="80"/>
+      </w:pPr>
+      <w:r>
+        <w:rPr>
+          <w:rFonts w:ascii="Calibri" w:hAnsi="Calibri"/>
+          <w:b/>
+          <w:color w:val="0052CC"/>
+          <w:sz w:val="30"/>
+        </w:rPr>
+        <w:t>Chapter 8: Troubleshooting Guide</w:t>
+      </w:r>
+    </w:p>
+    <w:p>
+      <w:pPr>
+        <w:spacing w:before="40" w:after="80" w:line="276" w:lineRule="auto"/>
+      </w:pPr>
+      <w:r>
+        <w:rPr>
+          <w:rFonts w:ascii="Calibri" w:hAnsi="Calibri"/>
+          <w:color w:val="172B4D"/>
+          <w:sz w:val="21"/>
+        </w:rPr>
+        <w:t>Error: OperationalError: database is locked</w:t>
+        <w:br/>
+        <w:t>Cause: SQLite uses file-level locking during write operations. Concurrent feast materialize executions can result in lock contention.</w:t>
+        <w:br/>
+        <w:t>Solution: Ensure only one container performs materialization at a time. In docker-compose.yml, set MATERIALIZE=true only on feast-server, keeping MATERIALIZE=false on feast-ui.</w:t>
+      </w:r>
+    </w:p>
+    <w:p>
+      <w:pPr>
+        <w:spacing w:before="40" w:after="80" w:line="276" w:lineRule="auto"/>
+      </w:pPr>
+      <w:r>
+        <w:rPr>
+          <w:rFonts w:ascii="Calibri" w:hAnsi="Calibri"/>
+          <w:color w:val="172B4D"/>
+          <w:sz w:val="21"/>
+        </w:rPr>
+        <w:t>Error: Bind mount permission denied on Linux hosts</w:t>
+        <w:br/>
+        <w:t>Cause: Docker runs container processes as root by default, creating root-owned files on host directories.</w:t>
+        <w:br/>
+        <w:t>Solution: Pass user identifier to compose or run chmod -R 777 feature_repo/data during local setup.</w:t>
+      </w:r>
+    </w:p>
+    <w:p>
+      <w:pPr>
+        <w:spacing w:before="40" w:after="80" w:line="276" w:lineRule="auto"/>
+      </w:pPr>
+      <w:r>
+        <w:rPr>
+          <w:rFonts w:ascii="Calibri" w:hAnsi="Calibri"/>
+          <w:color w:val="172B4D"/>
+          <w:sz w:val="21"/>
+        </w:rPr>
+        <w:t>Error: Missing Parquet dataset</w:t>
+        <w:br/>
+        <w:t>Cause: Container started before data/driver_stats.parquet was generated.</w:t>
+        <w:br/>
+        <w:t>Solution: The entrypoint.sh automatically checks for driver_stats.parquet and runs python3 generate_data.py if the file does not exist.</w:t>
+      </w:r>
+    </w:p>
     <w:p>
       <w:pPr>
         <w:spacing w:before="280" w:after="80"/>
@@ -3392,7 +4563,7 @@
                 <w:color w:val="172B4D"/>
                 <w:sz w:val="19"/>
               </w:rPr>
-              <w:t>FastAPI / Redis</w:t>
+              <w:t>FastAPI / SQLite</w:t>
             </w:r>
           </w:p>
         </w:tc>
@@ -3487,96 +4658,6 @@
           </w:p>
         </w:tc>
       </w:tr>
-      <w:tr>
-        <w:tc>
-          <w:tcPr>
-            <w:tcW w:type="dxa" w:w="2160"/>
-            <w:shd w:fill="FFFFFF"/>
-            <w:tcMar>
-              <w:top w:w="80" w:type="dxa"/>
-              <w:bottom w:w="80" w:type="dxa"/>
-              <w:left w:w="120" w:type="dxa"/>
-              <w:right w:w="120" w:type="dxa"/>
-            </w:tcMar>
-          </w:tcPr>
-          <w:p>
-            <w:r>
-              <w:rPr>
-                <w:rFonts w:ascii="Calibri" w:hAnsi="Calibri"/>
-                <w:color w:val="172B4D"/>
-                <w:sz w:val="19"/>
-              </w:rPr>
-              <w:t>redis</w:t>
-            </w:r>
-          </w:p>
-        </w:tc>
-        <w:tc>
-          <w:tcPr>
-            <w:tcW w:type="dxa" w:w="1440"/>
-            <w:shd w:fill="FFFFFF"/>
-            <w:tcMar>
-              <w:top w:w="80" w:type="dxa"/>
-              <w:bottom w:w="80" w:type="dxa"/>
-              <w:left w:w="120" w:type="dxa"/>
-              <w:right w:w="120" w:type="dxa"/>
-            </w:tcMar>
-          </w:tcPr>
-          <w:p>
-            <w:r>
-              <w:rPr>
-                <w:rFonts w:ascii="Calibri" w:hAnsi="Calibri"/>
-                <w:color w:val="172B4D"/>
-                <w:sz w:val="19"/>
-              </w:rPr>
-              <w:t>6379</w:t>
-            </w:r>
-          </w:p>
-        </w:tc>
-        <w:tc>
-          <w:tcPr>
-            <w:tcW w:type="dxa" w:w="3600"/>
-            <w:shd w:fill="FFFFFF"/>
-            <w:tcMar>
-              <w:top w:w="80" w:type="dxa"/>
-              <w:bottom w:w="80" w:type="dxa"/>
-              <w:left w:w="120" w:type="dxa"/>
-              <w:right w:w="120" w:type="dxa"/>
-            </w:tcMar>
-          </w:tcPr>
-          <w:p>
-            <w:r>
-              <w:rPr>
-                <w:rFonts w:ascii="Calibri" w:hAnsi="Calibri"/>
-                <w:color w:val="172B4D"/>
-                <w:sz w:val="19"/>
-              </w:rPr>
-              <w:t>In-memory key-value online store</w:t>
-            </w:r>
-          </w:p>
-        </w:tc>
-        <w:tc>
-          <w:tcPr>
-            <w:tcW w:type="dxa" w:w="2160"/>
-            <w:shd w:fill="FFFFFF"/>
-            <w:tcMar>
-              <w:top w:w="80" w:type="dxa"/>
-              <w:bottom w:w="80" w:type="dxa"/>
-              <w:left w:w="120" w:type="dxa"/>
-              <w:right w:w="120" w:type="dxa"/>
-            </w:tcMar>
-          </w:tcPr>
-          <w:p>
-            <w:r>
-              <w:rPr>
-                <w:rFonts w:ascii="Calibri" w:hAnsi="Calibri"/>
-                <w:color w:val="172B4D"/>
-                <w:sz w:val="19"/>
-              </w:rPr>
-              <w:t>Redis 7.2</w:t>
-            </w:r>
-          </w:p>
-        </w:tc>
-      </w:tr>
     </w:tbl>
     <w:p>
       <w:pPr>
@@ -3641,61 +4722,6 @@
     </w:tbl>
     <w:p>
       <w:pPr>
-        <w:spacing w:before="160" w:after="40"/>
-        <w:jc w:val="center"/>
-      </w:pPr>
-      <w:r>
-        <w:drawing>
-          <wp:inline xmlns:a="http://schemas.openxmlformats.org/drawingml/2006/main" xmlns:pic="http://schemas.openxmlformats.org/drawingml/2006/picture">
-            <wp:extent cx="5669280" cy="688413"/>
-            <wp:docPr id="6" name="Picture 6"/>
-            <wp:cNvGraphicFramePr>
-              <a:graphicFrameLocks noChangeAspect="1"/>
-            </wp:cNvGraphicFramePr>
-            <a:graphic>
-              <a:graphicData uri="http://schemas.openxmlformats.org/drawingml/2006/picture">
-                <pic:pic>
-                  <pic:nvPicPr>
-                    <pic:cNvPr id="0" name="ss5_feast_entities_list.png"/>
-                    <pic:cNvPicPr/>
-                  </pic:nvPicPr>
-                  <pic:blipFill>
-                    <a:blip r:embed="rId14"/>
-                    <a:stretch>
-                      <a:fillRect/>
-                    </a:stretch>
-                  </pic:blipFill>
-                  <pic:spPr>
-                    <a:xfrm>
-                      <a:off x="0" y="0"/>
-                      <a:ext cx="5669280" cy="688413"/>
-                    </a:xfrm>
-                    <a:prstGeom prst="rect"/>
-                  </pic:spPr>
-                </pic:pic>
-              </a:graphicData>
-            </a:graphic>
-          </wp:inline>
-        </w:drawing>
-      </w:r>
-    </w:p>
-    <w:p>
-      <w:pPr>
-        <w:spacing w:before="40" w:after="160"/>
-        <w:jc w:val="center"/>
-      </w:pPr>
-      <w:r>
-        <w:rPr>
-          <w:rFonts w:ascii="Calibri" w:hAnsi="Calibri"/>
-          <w:i/>
-          <w:color w:val="6B778C"/>
-          <w:sz w:val="19"/>
-        </w:rPr>
-        <w:t>Screenshot 5: Registered Feast Entities in SQLite Metadata Registry</w:t>
-      </w:r>
-    </w:p>
-    <w:p>
-      <w:pPr>
         <w:spacing w:before="280" w:after="80"/>
       </w:pPr>
       <w:r>
@@ -3718,7 +4744,7 @@
           <w:rFonts w:ascii="Calibri" w:hAnsi="Calibri"/>
           <w:sz w:val="20"/>
         </w:rPr>
-        <w:t>1. Decouple Offline Processing from Online Serving: Use column-oriented storage formats (Parquet) for batch model training and in-memory key-value stores (Redis) for low-latency inference.</w:t>
+        <w:t>1. Decouple Offline Processing from Online Serving: Use column-oriented storage formats (Parquet) for batch model training and low-latency structured stores (SQLite or Redis) for online inference.</w:t>
       </w:r>
     </w:p>
     <w:p>
@@ -3744,7 +4770,7 @@
           <w:rFonts w:ascii="Calibri" w:hAnsi="Calibri"/>
           <w:sz w:val="20"/>
         </w:rPr>
-        <w:t>3. Synchronize via Deterministic Materialization: Ingest historical metrics into online storage using explicit timestamps to avoid serving future observations.</w:t>
+        <w:t>3. Synchronize via Deterministic Materialization: Ingest historical metrics into online storage using explicit timestamp watermarks to avoid serving future observations.</w:t>
       </w:r>
     </w:p>
     <w:p>
@@ -3757,74 +4783,7 @@
           <w:rFonts w:ascii="Calibri" w:hAnsi="Calibri"/>
           <w:sz w:val="20"/>
         </w:rPr>
-        <w:t>4. Enforce Container Readiness: Configure Docker health checks to prevent dependent services from starting before backing datastores are ready to accept connections.</w:t>
-      </w:r>
-    </w:p>
-    <w:p>
-      <w:pPr>
-        <w:spacing w:before="280" w:after="80"/>
-      </w:pPr>
-      <w:r>
-        <w:rPr>
-          <w:rFonts w:ascii="Calibri" w:hAnsi="Calibri"/>
-          <w:b/>
-          <w:color w:val="0052CC"/>
-          <w:sz w:val="30"/>
-        </w:rPr>
-        <w:t>Troubleshooting</w:t>
-      </w:r>
-    </w:p>
-    <w:p>
-      <w:pPr>
-        <w:spacing w:before="40" w:after="80" w:line="276" w:lineRule="auto"/>
-      </w:pPr>
-      <w:r>
-        <w:rPr>
-          <w:rFonts w:ascii="Calibri" w:hAnsi="Calibri"/>
-          <w:color w:val="172B4D"/>
-          <w:sz w:val="21"/>
-        </w:rPr>
-        <w:t>Error: Connection refused to redis:6379</w:t>
-        <w:br/>
-        <w:t>Cause: feast-server initiated materialization before Redis was ready to accept TCP traffic.</w:t>
-        <w:br/>
-        <w:t>Solution: Ensure docker-compose.yml includes depends_on.redis.condition: service_healthy.</w:t>
-      </w:r>
-    </w:p>
-    <w:p>
-      <w:pPr>
-        <w:spacing w:before="40" w:after="80" w:line="276" w:lineRule="auto"/>
-      </w:pPr>
-      <w:r>
-        <w:rPr>
-          <w:rFonts w:ascii="Calibri" w:hAnsi="Calibri"/>
-          <w:color w:val="172B4D"/>
-          <w:sz w:val="21"/>
-        </w:rPr>
-        <w:t>Error: Status NOT_FOUND for valid entities</w:t>
-        <w:br/>
-        <w:t>Cause: The materialization timestamp parameter predates the event timestamps in data/driver_stats.parquet.</w:t>
-        <w:br/>
-        <w:t>Solution: Execute an explicit materialization command inside the running container:</w:t>
-        <w:br/>
-        <w:t>docker exec -it feast-server feast materialize-incremental $(date -u +"%Y-%m-%dT%H:%M:%S")</w:t>
-      </w:r>
-    </w:p>
-    <w:p>
-      <w:pPr>
-        <w:spacing w:before="40" w:after="80" w:line="276" w:lineRule="auto"/>
-      </w:pPr>
-      <w:r>
-        <w:rPr>
-          <w:rFonts w:ascii="Calibri" w:hAnsi="Calibri"/>
-          <w:color w:val="172B4D"/>
-          <w:sz w:val="21"/>
-        </w:rPr>
-        <w:t>Error: entrypoint.sh: \r: command not found</w:t>
-        <w:br/>
-        <w:t>Cause: Windows carriage return (CRLF) characters present in bash script.</w:t>
-        <w:br/>
-        <w:t>Solution: Run dos2unix entrypoint.sh or configure Git to check out files with LF line endings.</w:t>
+        <w:t>4. Guarantee Host Persistence with Bind Mounts: Mount host repository directories into containers to retain database schemas and materialized features across rebuild cycles.</w:t>
       </w:r>
     </w:p>
     <w:p>
@@ -3851,7 +4810,7 @@
           <w:color w:val="172B4D"/>
           <w:sz w:val="21"/>
         </w:rPr>
-        <w:t>In this lab, you successfully containerized Feast to construct a local, production-grade feature store architecture using Docker and Redis. By decoupling the file-based Parquet offline store from the in-memory Redis online store, you established a dual-tier storage pattern optimized for both batch training datasets and sub-millisecond real-time inference.</w:t>
+        <w:t>In this lab, you containerized Feast to construct a local, production-grade feature store architecture using Docker, SQLite, and host bind mounts. By pairing a local Parquet offline store with an embedded SQLite online store, you established a complete dual-tier feature store pattern with zero external daemon dependencies.</w:t>
       </w:r>
     </w:p>
     <w:p>
@@ -3877,7 +4836,7 @@
           <w:rFonts w:ascii="Calibri" w:hAnsi="Calibri"/>
           <w:sz w:val="20"/>
         </w:rPr>
-        <w:t>• Multi-Container Orchestration: Built a custom Docker image and orchestrated services using Docker Compose health checks and automated startup scripts.</w:t>
+        <w:t>• Host Storage Persistence: Persisted historical Parquet files, metadata registry tables, and SQLite online feature records directly on the host machine using Docker bind mounts.</w:t>
       </w:r>
     </w:p>
     <w:p>
@@ -3890,7 +4849,7 @@
           <w:rFonts w:ascii="Calibri" w:hAnsi="Calibri"/>
           <w:sz w:val="20"/>
         </w:rPr>
-        <w:t>• Deterministic Materialization: Synchronized historical batch observations from Parquet files into Redis using explicit timestamp watermarks.</w:t>
+        <w:t>• Automated Lifecycle Management: Built a custom Docker image and orchestrated services using Docker Compose and an automated entrypoint script.</w:t>
       </w:r>
     </w:p>
     <w:p>
@@ -3903,7 +4862,7 @@
           <w:rFonts w:ascii="Calibri" w:hAnsi="Calibri"/>
           <w:sz w:val="20"/>
         </w:rPr>
-        <w:t>• Low-Latency Feature Serving: Queried the Feast HTTP REST API to retrieve online feature vectors for live model inference and defensive validation.</w:t>
+        <w:t>• Deterministic Materialization: Synchronized historical batch observations from Parquet files into SQLite using explicit timestamp watermarks.</w:t>
       </w:r>
     </w:p>
     <w:p>
@@ -3916,7 +4875,20 @@
           <w:rFonts w:ascii="Calibri" w:hAnsi="Calibri"/>
           <w:sz w:val="20"/>
         </w:rPr>
-        <w:t>• Metadata Governance: Inspected registered entities, feature schemas, and storage backends using the interactive Feast Web UI catalog.</w:t>
+        <w:t>• Low-Latency Feature Serving: Queried the Feast HTTP REST API and direct SQLite tables to retrieve online feature vectors for live model inference.</w:t>
+      </w:r>
+    </w:p>
+    <w:p>
+      <w:pPr>
+        <w:spacing w:before="40" w:after="40"/>
+        <w:ind w:left="360"/>
+      </w:pPr>
+      <w:r>
+        <w:rPr>
+          <w:rFonts w:ascii="Calibri" w:hAnsi="Calibri"/>
+          <w:sz w:val="20"/>
+        </w:rPr>
+        <w:t>• Metadata Governance: Inspected registered entities, feature schemas, and storage backends using the interactive Feast Web UI catalog and Feast CLI tools.</w:t>
       </w:r>
     </w:p>
     <w:p>
@@ -3929,69 +4901,7 @@
           <w:color w:val="172B4D"/>
           <w:sz w:val="21"/>
         </w:rPr>
-        <w:t>This containerized setup provides a reproducible, portable foundation that can be transitioned to cloud-scale MLOps deployments utilizing managed databases, object stores, and Kubernetes clusters.</w:t>
-      </w:r>
-    </w:p>
-    <w:p>
-      <w:pPr>
-        <w:spacing w:before="280" w:after="80"/>
-      </w:pPr>
-      <w:r>
-        <w:rPr>
-          <w:rFonts w:ascii="Calibri" w:hAnsi="Calibri"/>
-          <w:b/>
-          <w:color w:val="0052CC"/>
-          <w:sz w:val="30"/>
-        </w:rPr>
-        <w:t>Next Steps</w:t>
-      </w:r>
-    </w:p>
-    <w:p>
-      <w:pPr>
-        <w:spacing w:before="40" w:after="80" w:line="276" w:lineRule="auto"/>
-      </w:pPr>
-      <w:r>
-        <w:rPr>
-          <w:rFonts w:ascii="Calibri" w:hAnsi="Calibri"/>
-          <w:color w:val="172B4D"/>
-          <w:sz w:val="21"/>
-        </w:rPr>
-        <w:t>1. Configure an on-demand feature view to calculate dynamic ratios during feature retrieval.</w:t>
-        <w:br/>
-        <w:t>2. Integrate Feast online feature retrieval directly into an ML inference service (such as FastAPI, MLflow, or Triton).</w:t>
-        <w:br/>
-        <w:t>3. Replace local Parquet files with an Amazon S3 or Google Cloud Storage bucket source.</w:t>
-      </w:r>
-    </w:p>
-    <w:p>
-      <w:pPr>
-        <w:spacing w:before="280" w:after="80"/>
-      </w:pPr>
-      <w:r>
-        <w:rPr>
-          <w:rFonts w:ascii="Calibri" w:hAnsi="Calibri"/>
-          <w:b/>
-          <w:color w:val="0052CC"/>
-          <w:sz w:val="30"/>
-        </w:rPr>
-        <w:t>Additional Resources</w:t>
-      </w:r>
-    </w:p>
-    <w:p>
-      <w:pPr>
-        <w:spacing w:before="40" w:after="80" w:line="276" w:lineRule="auto"/>
-      </w:pPr>
-      <w:r>
-        <w:rPr>
-          <w:rFonts w:ascii="Calibri" w:hAnsi="Calibri"/>
-          <w:color w:val="172B4D"/>
-          <w:sz w:val="21"/>
-        </w:rPr>
-        <w:t>- Official Feast Documentation: https://docs.feast.dev/</w:t>
-        <w:br/>
-        <w:t>- Feast Python SDK Reference: https://docs.feast.dev/reference/python-api-reference</w:t>
-        <w:br/>
-        <w:t>- Docker Compose Specification: https://docs.docker.com/compose/</w:t>
+        <w:t>This containerized setup provides a reproducible, lightweight, and portable foundation that can be transitioned to cloud-scale MLOps deployments utilizing managed databases, object stores, and Kubernetes clusters.</w:t>
       </w:r>
     </w:p>
     <w:sectPr>

</xml_diff>

<commit_message>
feat: add unified architecture diagram combining host bind mount and runtime flow concepts
</commit_message>
<xml_diff>
--- a/Dockerizing_Feast_Local_Feature_Store_Lab.docx
+++ b/Dockerizing_Feast_Local_Feature_Store_Lab.docx
@@ -66,7 +66,7 @@
       <w:r>
         <w:drawing>
           <wp:inline xmlns:a="http://schemas.openxmlformats.org/drawingml/2006/main" xmlns:pic="http://schemas.openxmlformats.org/drawingml/2006/picture">
-            <wp:extent cx="5486400" cy="3062177"/>
+            <wp:extent cx="5486400" cy="3265714"/>
             <wp:docPr id="1" name="Picture 1"/>
             <wp:cNvGraphicFramePr>
               <a:graphicFrameLocks noChangeAspect="1"/>
@@ -87,7 +87,7 @@
                   <pic:spPr>
                     <a:xfrm>
                       <a:off x="0" y="0"/>
-                      <a:ext cx="5486400" cy="3062177"/>
+                      <a:ext cx="5486400" cy="3265714"/>
                     </a:xfrm>
                     <a:prstGeom prst="rect"/>
                   </pic:spPr>

</xml_diff>

<commit_message>
feat: refine minimal architecture diagram and update documentation
</commit_message>
<xml_diff>
--- a/Dockerizing_Feast_Local_Feature_Store_Lab.docx
+++ b/Dockerizing_Feast_Local_Feature_Store_Lab.docx
@@ -66,7 +66,7 @@
       <w:r>
         <w:drawing>
           <wp:inline xmlns:a="http://schemas.openxmlformats.org/drawingml/2006/main" xmlns:pic="http://schemas.openxmlformats.org/drawingml/2006/picture">
-            <wp:extent cx="5486400" cy="3265714"/>
+            <wp:extent cx="5486400" cy="3008671"/>
             <wp:docPr id="1" name="Picture 1"/>
             <wp:cNvGraphicFramePr>
               <a:graphicFrameLocks noChangeAspect="1"/>
@@ -87,7 +87,7 @@
                   <pic:spPr>
                     <a:xfrm>
                       <a:off x="0" y="0"/>
-                      <a:ext cx="5486400" cy="3265714"/>
+                      <a:ext cx="5486400" cy="3008671"/>
                     </a:xfrm>
                     <a:prstGeom prst="rect"/>
                   </pic:spPr>

</xml_diff>